<commit_message>
Complete Phase 6 evaluation, naive training, and thesis figure generation
</commit_message>
<xml_diff>
--- a/22MIS0527_Review-1.docx
+++ b/22MIS0527_Review-1.docx
@@ -1,6 +1,6 @@
 
 <file path=word/document.xml><?xml version="1.0" encoding="utf-8"?>
-<w:document xmlns:wpc="http://schemas.microsoft.com/office/word/2010/wordprocessingCanvas" xmlns:cx="http://schemas.microsoft.com/office/drawing/2014/chartex" xmlns:cx1="http://schemas.microsoft.com/office/drawing/2015/9/8/chartex" xmlns:cx2="http://schemas.microsoft.com/office/drawing/2015/10/21/chartex" xmlns:cx3="http://schemas.microsoft.com/office/drawing/2016/5/9/chartex" xmlns:cx4="http://schemas.microsoft.com/office/drawing/2016/5/10/chartex" xmlns:cx5="http://schemas.microsoft.com/office/drawing/2016/5/11/chartex" xmlns:cx6="http://schemas.microsoft.com/office/drawing/2016/5/12/chartex" xmlns:cx7="http://schemas.microsoft.com/office/drawing/2016/5/13/chartex" xmlns:cx8="http://schemas.microsoft.com/office/drawing/2016/5/14/chartex" xmlns:mc="http://schemas.openxmlformats.org/markup-compatibility/2006" xmlns:aink="http://schemas.microsoft.com/office/drawing/2016/ink" xmlns:am3d="http://schemas.microsoft.com/office/drawing/2017/model3d" xmlns:o="urn:schemas-microsoft-com:office:office" xmlns:oel="http://schemas.microsoft.com/office/2019/extlst" xmlns:r="http://schemas.openxmlformats.org/officeDocument/2006/relationships" xmlns:m="http://schemas.openxmlformats.org/officeDocument/2006/math" xmlns:v="urn:schemas-microsoft-com:vml" xmlns:wp14="http://schemas.microsoft.com/office/word/2010/wordprocessingDrawing" xmlns:wp="http://schemas.openxmlformats.org/drawingml/2006/wordprocessingDrawing" xmlns:w10="urn:schemas-microsoft-com:office:word" xmlns:w="http://schemas.openxmlformats.org/wordprocessingml/2006/main" xmlns:w14="http://schemas.microsoft.com/office/word/2010/wordml" xmlns:w15="http://schemas.microsoft.com/office/word/2012/wordml" xmlns:w16cei="http://schemas.microsoft.com/office/word/2026/wordml/cei" xmlns:w16cex="http://schemas.microsoft.com/office/word/2018/wordml/cex" xmlns:w16cid="http://schemas.microsoft.com/office/word/2016/wordml/cid" xmlns:w16="http://schemas.microsoft.com/office/word/2018/wordml" xmlns:w16du="http://schemas.microsoft.com/office/word/2023/wordml/word16du" xmlns:w16sdtdh="http://schemas.microsoft.com/office/word/2020/wordml/sdtdatahash" xmlns:w16sdtfl="http://schemas.microsoft.com/office/word/2024/wordml/sdtformatlock" xmlns:w16se="http://schemas.microsoft.com/office/word/2015/wordml/symex" xmlns:wpg="http://schemas.microsoft.com/office/word/2010/wordprocessingGroup" xmlns:wpi="http://schemas.microsoft.com/office/word/2010/wordprocessingInk" xmlns:wne="http://schemas.microsoft.com/office/word/2006/wordml" xmlns:wps="http://schemas.microsoft.com/office/word/2010/wordprocessingShape" mc:Ignorable="w14 w15 w16se w16cid w16 w16cex w16sdtdh w16sdtfl w16du wp14">
+<w:document xmlns:wpc="http://schemas.microsoft.com/office/word/2010/wordprocessingCanvas" xmlns:cx="http://schemas.microsoft.com/office/drawing/2014/chartex" xmlns:cx1="http://schemas.microsoft.com/office/drawing/2015/9/8/chartex" xmlns:cx2="http://schemas.microsoft.com/office/drawing/2015/10/21/chartex" xmlns:cx3="http://schemas.microsoft.com/office/drawing/2016/5/9/chartex" xmlns:cx4="http://schemas.microsoft.com/office/drawing/2016/5/10/chartex" xmlns:cx5="http://schemas.microsoft.com/office/drawing/2016/5/11/chartex" xmlns:cx6="http://schemas.microsoft.com/office/drawing/2016/5/12/chartex" xmlns:cx7="http://schemas.microsoft.com/office/drawing/2016/5/13/chartex" xmlns:cx8="http://schemas.microsoft.com/office/drawing/2016/5/14/chartex" xmlns:mc="http://schemas.openxmlformats.org/markup-compatibility/2006" xmlns:aink="http://schemas.microsoft.com/office/drawing/2016/ink" xmlns:am3d="http://schemas.microsoft.com/office/drawing/2017/model3d" xmlns:o="urn:schemas-microsoft-com:office:office" xmlns:oel="http://schemas.microsoft.com/office/2019/extlst" xmlns:r="http://schemas.openxmlformats.org/officeDocument/2006/relationships" xmlns:m="http://schemas.openxmlformats.org/officeDocument/2006/math" xmlns:v="urn:schemas-microsoft-com:vml" xmlns:wp14="http://schemas.microsoft.com/office/word/2010/wordprocessingDrawing" xmlns:wp="http://schemas.openxmlformats.org/drawingml/2006/wordprocessingDrawing" xmlns:w10="urn:schemas-microsoft-com:office:word" xmlns:w="http://schemas.openxmlformats.org/wordprocessingml/2006/main" xmlns:w14="http://schemas.microsoft.com/office/word/2010/wordml" xmlns:w15="http://schemas.microsoft.com/office/word/2012/wordml" xmlns:w16cex="http://schemas.microsoft.com/office/word/2018/wordml/cex" xmlns:w16cid="http://schemas.microsoft.com/office/word/2016/wordml/cid" xmlns:w16="http://schemas.microsoft.com/office/word/2018/wordml" xmlns:w16du="http://schemas.microsoft.com/office/word/2023/wordml/word16du" xmlns:w16sdtdh="http://schemas.microsoft.com/office/word/2020/wordml/sdtdatahash" xmlns:w16sdtfl="http://schemas.microsoft.com/office/word/2024/wordml/sdtformatlock" xmlns:w16se="http://schemas.microsoft.com/office/word/2015/wordml/symex" xmlns:wpg="http://schemas.microsoft.com/office/word/2010/wordprocessingGroup" xmlns:wpi="http://schemas.microsoft.com/office/word/2010/wordprocessingInk" xmlns:wne="http://schemas.microsoft.com/office/word/2006/wordml" xmlns:wps="http://schemas.microsoft.com/office/word/2010/wordprocessingShape" mc:Ignorable="w14 w15 w16se w16cid w16 w16cex w16sdtdh w16sdtfl w16du wp14">
   <w:body>
     <w:p>
       <w:pPr>
@@ -667,18 +667,8 @@
           <w:szCs w:val="26"/>
         </w:rPr>
         <w:tab/>
-      </w:r>
-      <w:proofErr w:type="spellStart"/>
-      <w:r>
-        <w:rPr>
-          <w:rFonts w:ascii="Times New Roman" w:hAnsi="Times New Roman" w:cs="Times New Roman"/>
-          <w:b/>
-          <w:sz w:val="26"/>
-          <w:szCs w:val="26"/>
-        </w:rPr>
         <w:t>Signature</w:t>
       </w:r>
-      <w:proofErr w:type="spellEnd"/>
     </w:p>
     <w:p>
       <w:pPr>
@@ -739,61 +729,7 @@
           <w:sz w:val="24"/>
           <w:szCs w:val="24"/>
         </w:rPr>
-        <w:t xml:space="preserve">Internet of Medical Things (IoMT) devices continuously transmit patient vital signs, making them attractive targets for False Data Injection (FDI) attacks that falsify sensor readings and threaten patient safety. Existing physiology-aware detection methods validate each physiological channel independently against plausible medical ranges, leaving a blind spot: a coordinated adversary can manipulate multiple correlated vital-sign channels simultaneously, keeping each individual reading physiologically plausible while the combination violates known relationships between vital signs. This coordinated multi-channel FDI threat has received limited attention and remains insufficiently addressed in existing IoMT security literature. To address this gap, the project proposes a Cross-Sensor Consistency </w:t>
-      </w:r>
-      <w:proofErr w:type="spellStart"/>
-      <w:r>
-        <w:rPr>
-          <w:rFonts w:ascii="Times New Roman" w:hAnsi="Times New Roman" w:cs="Times New Roman"/>
-          <w:sz w:val="24"/>
-          <w:szCs w:val="24"/>
-        </w:rPr>
-        <w:t>Modeling</w:t>
-      </w:r>
-      <w:proofErr w:type="spellEnd"/>
-      <w:r>
-        <w:rPr>
-          <w:rFonts w:ascii="Times New Roman" w:hAnsi="Times New Roman" w:cs="Times New Roman"/>
-          <w:sz w:val="24"/>
-          <w:szCs w:val="24"/>
-        </w:rPr>
-        <w:t xml:space="preserve"> (CSCM) framework that jointly </w:t>
-      </w:r>
-      <w:proofErr w:type="spellStart"/>
-      <w:r>
-        <w:rPr>
-          <w:rFonts w:ascii="Times New Roman" w:hAnsi="Times New Roman" w:cs="Times New Roman"/>
-          <w:sz w:val="24"/>
-          <w:szCs w:val="24"/>
-        </w:rPr>
-        <w:t>analyzes</w:t>
-      </w:r>
-      <w:proofErr w:type="spellEnd"/>
-      <w:r>
-        <w:rPr>
-          <w:rFonts w:ascii="Times New Roman" w:hAnsi="Times New Roman" w:cs="Times New Roman"/>
-          <w:sz w:val="24"/>
-          <w:szCs w:val="24"/>
-        </w:rPr>
-        <w:t xml:space="preserve"> relationships among vital-sign channels using a physiology-aware graph attention approach informed by known clinical correlations. The framework will be implemented and evaluated on public ICU and wearable physiological datasets, including PhysioNet/CinC-2012, MIMIC-III Waveform, and WESAD, using physiological variables available in each dataset, and benchmarked against single-channel baselines to assess effectiveness against coordinated attacks while preserving performance on conventional scenarios. This research aims to contribute: (</w:t>
-      </w:r>
-      <w:proofErr w:type="spellStart"/>
-      <w:r>
-        <w:rPr>
-          <w:rFonts w:ascii="Times New Roman" w:hAnsi="Times New Roman" w:cs="Times New Roman"/>
-          <w:sz w:val="24"/>
-          <w:szCs w:val="24"/>
-        </w:rPr>
-        <w:t>i</w:t>
-      </w:r>
-      <w:proofErr w:type="spellEnd"/>
-      <w:r>
-        <w:rPr>
-          <w:rFonts w:ascii="Times New Roman" w:hAnsi="Times New Roman" w:cs="Times New Roman"/>
-          <w:sz w:val="24"/>
-          <w:szCs w:val="24"/>
-        </w:rPr>
-        <w:t>) a coordinated multi-channel FDI attack model, (ii) a physiology-aware CSCM framework for coordinated attack detection, and (iii) an experimental evaluation across multiple public healthcare datasets, addressing an underexplored security vulnerability in medical IoT networks.</w:t>
+        <w:t>Internet of Medical Things (IoMT) devices continuously transmit patient vital signs, making them attractive targets for False Data Injection (FDI) attacks that falsify sensor readings and threaten patient safety. Existing physiology-aware detection methods validate each physiological channel independently against plausible medical ranges, leaving a blind spot: a coordinated adversary can manipulate multiple correlated vital-sign channels simultaneously, keeping each individual reading physiologically plausible while the combination violates known relationships between vital signs. This coordinated multi-channel FDI threat has received limited attention and remains insufficiently addressed in existing IoMT security literature. To address this gap, the project proposes a Cross-Sensor Consistency Modeling (CSCM) framework that jointly analyzes relationships among vital-sign channels using a physiology-aware graph attention approach informed by known clinical correlations. The framework will be implemented and evaluated on public ICU and wearable physiological datasets, including PhysioNet/CinC-2012, MIMIC-III Waveform, and WESAD, using physiological variables available in each dataset, and benchmarked against single-channel baselines to assess effectiveness against coordinated attacks while preserving performance on conventional scenarios. This research aims to contribute: (i) a coordinated multi-channel FDI attack model, (ii) a physiology-aware CSCM framework for coordinated attack detection, and (iii) an experimental evaluation across multiple public healthcare datasets, addressing an underexplored security vulnerability in medical IoT networks.</w:t>
       </w:r>
     </w:p>
     <w:p>
@@ -824,16 +760,7 @@
           <w:sz w:val="24"/>
           <w:szCs w:val="24"/>
         </w:rPr>
-        <w:t>Internet of Medical Things (IoMT</w:t>
-      </w:r>
-      <w:proofErr w:type="gramStart"/>
-      <w:r>
-        <w:rPr>
-          <w:rFonts w:ascii="Times New Roman" w:hAnsi="Times New Roman" w:cs="Times New Roman"/>
-          <w:sz w:val="24"/>
-          <w:szCs w:val="24"/>
-        </w:rPr>
-        <w:t>)</w:t>
+        <w:t>Internet of Medical Things (IoMT)</w:t>
       </w:r>
       <w:r>
         <w:rPr>
@@ -849,16 +776,7 @@
           <w:sz w:val="24"/>
           <w:szCs w:val="24"/>
         </w:rPr>
-        <w:t>False</w:t>
-      </w:r>
-      <w:proofErr w:type="gramEnd"/>
-      <w:r>
-        <w:rPr>
-          <w:rFonts w:ascii="Times New Roman" w:hAnsi="Times New Roman" w:cs="Times New Roman"/>
-          <w:sz w:val="24"/>
-          <w:szCs w:val="24"/>
-        </w:rPr>
-        <w:t xml:space="preserve"> Data Injection Attack (FDIA)</w:t>
+        <w:t>False Data Injection Attack (FDIA)</w:t>
       </w:r>
       <w:r>
         <w:rPr>
@@ -906,18 +824,8 @@
           <w:sz w:val="24"/>
           <w:szCs w:val="24"/>
         </w:rPr>
-        <w:t xml:space="preserve"> Cross-Sensor Consistency </w:t>
-      </w:r>
-      <w:proofErr w:type="spellStart"/>
-      <w:r>
-        <w:rPr>
-          <w:rFonts w:ascii="Times New Roman" w:hAnsi="Times New Roman" w:cs="Times New Roman"/>
-          <w:sz w:val="24"/>
-          <w:szCs w:val="24"/>
-        </w:rPr>
-        <w:t>Modeling</w:t>
-      </w:r>
-      <w:proofErr w:type="spellEnd"/>
+        <w:t xml:space="preserve"> Cross-Sensor Consistency Modeling</w:t>
+      </w:r>
       <w:r>
         <w:rPr>
           <w:rFonts w:ascii="Times New Roman" w:hAnsi="Times New Roman" w:cs="Times New Roman"/>
@@ -1312,43 +1220,7 @@
           <w:sz w:val="24"/>
           <w:szCs w:val="24"/>
         </w:rPr>
-        <w:t xml:space="preserve">To design and implement a physiology-aware Cross-Sensor Consistency </w:t>
-      </w:r>
-      <w:proofErr w:type="spellStart"/>
-      <w:r>
-        <w:rPr>
-          <w:rFonts w:ascii="Times New Roman" w:hAnsi="Times New Roman" w:cs="Times New Roman"/>
-          <w:sz w:val="24"/>
-          <w:szCs w:val="24"/>
-        </w:rPr>
-        <w:t>Modeling</w:t>
-      </w:r>
-      <w:proofErr w:type="spellEnd"/>
-      <w:r>
-        <w:rPr>
-          <w:rFonts w:ascii="Times New Roman" w:hAnsi="Times New Roman" w:cs="Times New Roman"/>
-          <w:sz w:val="24"/>
-          <w:szCs w:val="24"/>
-        </w:rPr>
-        <w:t xml:space="preserve"> (CSCM) framework using a graph attention-based approach that </w:t>
-      </w:r>
-      <w:proofErr w:type="spellStart"/>
-      <w:r>
-        <w:rPr>
-          <w:rFonts w:ascii="Times New Roman" w:hAnsi="Times New Roman" w:cs="Times New Roman"/>
-          <w:sz w:val="24"/>
-          <w:szCs w:val="24"/>
-        </w:rPr>
-        <w:t>analyzes</w:t>
-      </w:r>
-      <w:proofErr w:type="spellEnd"/>
-      <w:r>
-        <w:rPr>
-          <w:rFonts w:ascii="Times New Roman" w:hAnsi="Times New Roman" w:cs="Times New Roman"/>
-          <w:sz w:val="24"/>
-          <w:szCs w:val="24"/>
-        </w:rPr>
-        <w:t xml:space="preserve"> relationships among vital-sign channels. </w:t>
+        <w:t xml:space="preserve">To design and implement a physiology-aware Cross-Sensor Consistency Modeling (CSCM) framework using a graph attention-based approach that analyzes relationships among vital-sign channels. </w:t>
       </w:r>
     </w:p>
     <w:p>
@@ -1394,25 +1266,7 @@
           <w:sz w:val="24"/>
           <w:szCs w:val="24"/>
         </w:rPr>
-        <w:t xml:space="preserve">To </w:t>
-      </w:r>
-      <w:proofErr w:type="spellStart"/>
-      <w:r>
-        <w:rPr>
-          <w:rFonts w:ascii="Times New Roman" w:hAnsi="Times New Roman" w:cs="Times New Roman"/>
-          <w:sz w:val="24"/>
-          <w:szCs w:val="24"/>
-        </w:rPr>
-        <w:t>analyze</w:t>
-      </w:r>
-      <w:proofErr w:type="spellEnd"/>
-      <w:r>
-        <w:rPr>
-          <w:rFonts w:ascii="Times New Roman" w:hAnsi="Times New Roman" w:cs="Times New Roman"/>
-          <w:sz w:val="24"/>
-          <w:szCs w:val="24"/>
-        </w:rPr>
-        <w:t xml:space="preserve"> the framework's ability to detect coordinated attacks while preserving performance on conventional single-channel attack scenarios.</w:t>
+        <w:t>To analyze the framework's ability to detect coordinated attacks while preserving performance on conventional single-channel attack scenarios.</w:t>
       </w:r>
     </w:p>
     <w:p>
@@ -1514,25 +1368,7 @@
           <w:sz w:val="24"/>
           <w:szCs w:val="24"/>
         </w:rPr>
-        <w:t xml:space="preserve">Design and implementation of a physiology-aware Cross-Sensor Consistency </w:t>
-      </w:r>
-      <w:proofErr w:type="spellStart"/>
-      <w:r>
-        <w:rPr>
-          <w:rFonts w:ascii="Times New Roman" w:hAnsi="Times New Roman" w:cs="Times New Roman"/>
-          <w:sz w:val="24"/>
-          <w:szCs w:val="24"/>
-        </w:rPr>
-        <w:t>Modeling</w:t>
-      </w:r>
-      <w:proofErr w:type="spellEnd"/>
-      <w:r>
-        <w:rPr>
-          <w:rFonts w:ascii="Times New Roman" w:hAnsi="Times New Roman" w:cs="Times New Roman"/>
-          <w:sz w:val="24"/>
-          <w:szCs w:val="24"/>
-        </w:rPr>
-        <w:t xml:space="preserve"> framework using graph attention-based deep learning, with physiological variables selected or derived as appropriate to each dataset's available channels.</w:t>
+        <w:t>Design and implementation of a physiology-aware Cross-Sensor Consistency Modeling framework using graph attention-based deep learning, with physiological variables selected or derived as appropriate to each dataset's available channels.</w:t>
       </w:r>
     </w:p>
     <w:p>
@@ -1668,25 +1504,7 @@
           <w:sz w:val="24"/>
           <w:szCs w:val="24"/>
         </w:rPr>
-        <w:t xml:space="preserve">The proposed system consists of three main components. First, a coordinated multi-channel attack generator simulates an adversary capable of manipulating multiple correlated physiological channels simultaneously, ensuring each injected value remains within medically plausible bounds while violating the joint physiological relationships expected between channels. Second, a Cross-Sensor Consistency </w:t>
-      </w:r>
-      <w:proofErr w:type="spellStart"/>
-      <w:r>
-        <w:rPr>
-          <w:rFonts w:ascii="Times New Roman" w:hAnsi="Times New Roman" w:cs="Times New Roman"/>
-          <w:sz w:val="24"/>
-          <w:szCs w:val="24"/>
-        </w:rPr>
-        <w:t>Modeling</w:t>
-      </w:r>
-      <w:proofErr w:type="spellEnd"/>
-      <w:r>
-        <w:rPr>
-          <w:rFonts w:ascii="Times New Roman" w:hAnsi="Times New Roman" w:cs="Times New Roman"/>
-          <w:sz w:val="24"/>
-          <w:szCs w:val="24"/>
-        </w:rPr>
-        <w:t xml:space="preserve"> (CSCM) framework serves as the core detection mechanism, using a graph attention network built on a physiologically-informed graph representing known clinical relationships between vital-sign channels, allowing the model to learn and score the consistency of the joint pattern across channels rather than validating each channel in isolation. Third, an evaluation and benchmarking module compares the proposed framework against existing single-channel detection baselines using standard metrics (sensitivity, specificity, F1-score, AUROC) and statistical significance testing (e.g., McNemar's test), across PhysioNet/CinC-2012, WESAD, and — pending credentialing — MIMIC-III Waveform, to assess both detection effectiveness against coordinated attacks and generalization across data sources. An explainability component is incorporated to indicate which sensor-channel relationships contributed to a given detection decision, supporting interpretability for clinical and technical stakeholders.</w:t>
+        <w:t>The proposed system consists of three main components. First, a coordinated multi-channel attack generator simulates an adversary capable of manipulating multiple correlated physiological channels simultaneously, ensuring each injected value remains within medically plausible bounds while violating the joint physiological relationships expected between channels. Second, a Cross-Sensor Consistency Modeling (CSCM) framework serves as the core detection mechanism, using a graph attention network built on a physiologically-informed graph representing known clinical relationships between vital-sign channels, allowing the model to learn and score the consistency of the joint pattern across channels rather than validating each channel in isolation. Third, an evaluation and benchmarking module compares the proposed framework against existing single-channel detection baselines using standard metrics (sensitivity, specificity, F1-score, AUROC) and statistical significance testing (e.g., McNemar's test), across PhysioNet/CinC-2012, WESAD, and — pending credentialing — MIMIC-III Waveform, to assess both detection effectiveness against coordinated attacks and generalization across data sources. An explainability component is incorporated to indicate which sensor-channel relationships contributed to a given detection decision, supporting interpretability for clinical and technical stakeholders.</w:t>
       </w:r>
     </w:p>
     <w:p>
@@ -1769,7 +1587,6 @@
                 <w:szCs w:val="24"/>
               </w:rPr>
             </w:pPr>
-            <w:proofErr w:type="spellStart"/>
             <w:r>
               <w:rPr>
                 <w:rFonts w:ascii="Times New Roman" w:hAnsi="Times New Roman" w:cs="Times New Roman"/>
@@ -1778,10 +1595,18 @@
                 <w:sz w:val="24"/>
                 <w:szCs w:val="24"/>
               </w:rPr>
-              <w:t>S.No</w:t>
-            </w:r>
-            <w:proofErr w:type="spellEnd"/>
-            <w:r>
+              <w:t>S.No.</w:t>
+            </w:r>
+          </w:p>
+        </w:tc>
+        <w:tc>
+          <w:tcPr>
+            <w:tcW w:w="0" w:type="auto"/>
+            <w:hideMark/>
+          </w:tcPr>
+          <w:p>
+            <w:pPr>
+              <w:spacing w:after="160" w:line="259" w:lineRule="auto"/>
               <w:rPr>
                 <w:rFonts w:ascii="Times New Roman" w:hAnsi="Times New Roman" w:cs="Times New Roman"/>
                 <w:b/>
@@ -1789,18 +1614,8 @@
                 <w:sz w:val="24"/>
                 <w:szCs w:val="24"/>
               </w:rPr>
-              <w:t>.</w:t>
-            </w:r>
-          </w:p>
-        </w:tc>
-        <w:tc>
-          <w:tcPr>
-            <w:tcW w:w="0" w:type="auto"/>
-            <w:hideMark/>
-          </w:tcPr>
-          <w:p>
-            <w:pPr>
-              <w:spacing w:after="160" w:line="259" w:lineRule="auto"/>
+            </w:pPr>
+            <w:r>
               <w:rPr>
                 <w:rFonts w:ascii="Times New Roman" w:hAnsi="Times New Roman" w:cs="Times New Roman"/>
                 <w:b/>
@@ -1808,8 +1623,18 @@
                 <w:sz w:val="24"/>
                 <w:szCs w:val="24"/>
               </w:rPr>
-            </w:pPr>
-            <w:r>
+              <w:t>Title / Journal or Conference / Publisher / Author(s) &amp; Year</w:t>
+            </w:r>
+          </w:p>
+        </w:tc>
+        <w:tc>
+          <w:tcPr>
+            <w:tcW w:w="0" w:type="auto"/>
+            <w:hideMark/>
+          </w:tcPr>
+          <w:p>
+            <w:pPr>
+              <w:spacing w:after="160" w:line="259" w:lineRule="auto"/>
               <w:rPr>
                 <w:rFonts w:ascii="Times New Roman" w:hAnsi="Times New Roman" w:cs="Times New Roman"/>
                 <w:b/>
@@ -1817,18 +1642,8 @@
                 <w:sz w:val="24"/>
                 <w:szCs w:val="24"/>
               </w:rPr>
-              <w:t>Title / Journal or Conference / Publisher / Author(s) &amp; Year</w:t>
-            </w:r>
-          </w:p>
-        </w:tc>
-        <w:tc>
-          <w:tcPr>
-            <w:tcW w:w="0" w:type="auto"/>
-            <w:hideMark/>
-          </w:tcPr>
-          <w:p>
-            <w:pPr>
-              <w:spacing w:after="160" w:line="259" w:lineRule="auto"/>
+            </w:pPr>
+            <w:r>
               <w:rPr>
                 <w:rFonts w:ascii="Times New Roman" w:hAnsi="Times New Roman" w:cs="Times New Roman"/>
                 <w:b/>
@@ -1836,8 +1651,18 @@
                 <w:sz w:val="24"/>
                 <w:szCs w:val="24"/>
               </w:rPr>
-            </w:pPr>
-            <w:r>
+              <w:t>Methodology</w:t>
+            </w:r>
+          </w:p>
+        </w:tc>
+        <w:tc>
+          <w:tcPr>
+            <w:tcW w:w="0" w:type="auto"/>
+            <w:hideMark/>
+          </w:tcPr>
+          <w:p>
+            <w:pPr>
+              <w:spacing w:after="160" w:line="259" w:lineRule="auto"/>
               <w:rPr>
                 <w:rFonts w:ascii="Times New Roman" w:hAnsi="Times New Roman" w:cs="Times New Roman"/>
                 <w:b/>
@@ -1845,18 +1670,8 @@
                 <w:sz w:val="24"/>
                 <w:szCs w:val="24"/>
               </w:rPr>
-              <w:t>Methodology</w:t>
-            </w:r>
-          </w:p>
-        </w:tc>
-        <w:tc>
-          <w:tcPr>
-            <w:tcW w:w="0" w:type="auto"/>
-            <w:hideMark/>
-          </w:tcPr>
-          <w:p>
-            <w:pPr>
-              <w:spacing w:after="160" w:line="259" w:lineRule="auto"/>
+            </w:pPr>
+            <w:r>
               <w:rPr>
                 <w:rFonts w:ascii="Times New Roman" w:hAnsi="Times New Roman" w:cs="Times New Roman"/>
                 <w:b/>
@@ -1864,8 +1679,18 @@
                 <w:sz w:val="24"/>
                 <w:szCs w:val="24"/>
               </w:rPr>
-            </w:pPr>
-            <w:r>
+              <w:t>Key Contribution</w:t>
+            </w:r>
+          </w:p>
+        </w:tc>
+        <w:tc>
+          <w:tcPr>
+            <w:tcW w:w="0" w:type="auto"/>
+            <w:hideMark/>
+          </w:tcPr>
+          <w:p>
+            <w:pPr>
+              <w:spacing w:after="160" w:line="259" w:lineRule="auto"/>
               <w:rPr>
                 <w:rFonts w:ascii="Times New Roman" w:hAnsi="Times New Roman" w:cs="Times New Roman"/>
                 <w:b/>
@@ -1873,18 +1698,8 @@
                 <w:sz w:val="24"/>
                 <w:szCs w:val="24"/>
               </w:rPr>
-              <w:t>Key Contribution</w:t>
-            </w:r>
-          </w:p>
-        </w:tc>
-        <w:tc>
-          <w:tcPr>
-            <w:tcW w:w="0" w:type="auto"/>
-            <w:hideMark/>
-          </w:tcPr>
-          <w:p>
-            <w:pPr>
-              <w:spacing w:after="160" w:line="259" w:lineRule="auto"/>
+            </w:pPr>
+            <w:r>
               <w:rPr>
                 <w:rFonts w:ascii="Times New Roman" w:hAnsi="Times New Roman" w:cs="Times New Roman"/>
                 <w:b/>
@@ -1892,8 +1707,18 @@
                 <w:sz w:val="24"/>
                 <w:szCs w:val="24"/>
               </w:rPr>
-            </w:pPr>
-            <w:r>
+              <w:t>Limitations / Gap</w:t>
+            </w:r>
+          </w:p>
+        </w:tc>
+        <w:tc>
+          <w:tcPr>
+            <w:tcW w:w="0" w:type="auto"/>
+            <w:hideMark/>
+          </w:tcPr>
+          <w:p>
+            <w:pPr>
+              <w:spacing w:after="160" w:line="259" w:lineRule="auto"/>
               <w:rPr>
                 <w:rFonts w:ascii="Times New Roman" w:hAnsi="Times New Roman" w:cs="Times New Roman"/>
                 <w:b/>
@@ -1901,18 +1726,8 @@
                 <w:sz w:val="24"/>
                 <w:szCs w:val="24"/>
               </w:rPr>
-              <w:t>Limitations / Gap</w:t>
-            </w:r>
-          </w:p>
-        </w:tc>
-        <w:tc>
-          <w:tcPr>
-            <w:tcW w:w="0" w:type="auto"/>
-            <w:hideMark/>
-          </w:tcPr>
-          <w:p>
-            <w:pPr>
-              <w:spacing w:after="160" w:line="259" w:lineRule="auto"/>
+            </w:pPr>
+            <w:r>
               <w:rPr>
                 <w:rFonts w:ascii="Times New Roman" w:hAnsi="Times New Roman" w:cs="Times New Roman"/>
                 <w:b/>
@@ -1920,15 +1735,6 @@
                 <w:sz w:val="24"/>
                 <w:szCs w:val="24"/>
               </w:rPr>
-            </w:pPr>
-            <w:r>
-              <w:rPr>
-                <w:rFonts w:ascii="Times New Roman" w:hAnsi="Times New Roman" w:cs="Times New Roman"/>
-                <w:b/>
-                <w:bCs/>
-                <w:sz w:val="24"/>
-                <w:szCs w:val="24"/>
-              </w:rPr>
               <w:t>Relevance to Project</w:t>
             </w:r>
           </w:p>
@@ -1979,25 +1785,7 @@
                 <w:sz w:val="24"/>
                 <w:szCs w:val="24"/>
               </w:rPr>
-              <w:t>“</w:t>
-            </w:r>
-            <w:proofErr w:type="spellStart"/>
-            <w:r>
-              <w:rPr>
-                <w:rFonts w:ascii="Times New Roman" w:hAnsi="Times New Roman" w:cs="Times New Roman"/>
-                <w:sz w:val="24"/>
-                <w:szCs w:val="24"/>
-              </w:rPr>
-              <w:t>ConAML</w:t>
-            </w:r>
-            <w:proofErr w:type="spellEnd"/>
-            <w:r>
-              <w:rPr>
-                <w:rFonts w:ascii="Times New Roman" w:hAnsi="Times New Roman" w:cs="Times New Roman"/>
-                <w:sz w:val="24"/>
-                <w:szCs w:val="24"/>
-              </w:rPr>
-              <w:t xml:space="preserve">: Constrained Adversarial Machine Learning for Cyber-Physical Systems” — </w:t>
+              <w:t xml:space="preserve">“ConAML: Constrained Adversarial Machine Learning for Cyber-Physical Systems” — </w:t>
             </w:r>
             <w:r>
               <w:rPr>
@@ -2179,25 +1967,7 @@
                 <w:sz w:val="24"/>
                 <w:szCs w:val="24"/>
               </w:rPr>
-              <w:t xml:space="preserve"> — Elsevier — Padhan &amp; </w:t>
-            </w:r>
-            <w:proofErr w:type="spellStart"/>
-            <w:r>
-              <w:rPr>
-                <w:rFonts w:ascii="Times New Roman" w:hAnsi="Times New Roman" w:cs="Times New Roman"/>
-                <w:sz w:val="24"/>
-                <w:szCs w:val="24"/>
-              </w:rPr>
-              <w:t>Turuk</w:t>
-            </w:r>
-            <w:proofErr w:type="spellEnd"/>
-            <w:r>
-              <w:rPr>
-                <w:rFonts w:ascii="Times New Roman" w:hAnsi="Times New Roman" w:cs="Times New Roman"/>
-                <w:sz w:val="24"/>
-                <w:szCs w:val="24"/>
-              </w:rPr>
-              <w:t xml:space="preserve"> (2025)</w:t>
+              <w:t xml:space="preserve"> — Elsevier — Padhan &amp; Turuk (2025)</w:t>
             </w:r>
           </w:p>
         </w:tc>
@@ -2725,25 +2495,7 @@
                 <w:sz w:val="24"/>
                 <w:szCs w:val="24"/>
               </w:rPr>
-              <w:t xml:space="preserve">Uses multi-scale signature matrices with convolutional encoding and </w:t>
-            </w:r>
-            <w:proofErr w:type="spellStart"/>
-            <w:r>
-              <w:rPr>
-                <w:rFonts w:ascii="Times New Roman" w:hAnsi="Times New Roman" w:cs="Times New Roman"/>
-                <w:sz w:val="24"/>
-                <w:szCs w:val="24"/>
-              </w:rPr>
-              <w:t>ConvLSTM</w:t>
-            </w:r>
-            <w:proofErr w:type="spellEnd"/>
-            <w:r>
-              <w:rPr>
-                <w:rFonts w:ascii="Times New Roman" w:hAnsi="Times New Roman" w:cs="Times New Roman"/>
-                <w:sz w:val="24"/>
-                <w:szCs w:val="24"/>
-              </w:rPr>
-              <w:t xml:space="preserve"> to model inter-sensor correlations and temporal patterns.</w:t>
+              <w:t>Uses multi-scale signature matrices with convolutional encoding and ConvLSTM to model inter-sensor correlations and temporal patterns.</w:t>
             </w:r>
           </w:p>
         </w:tc>
@@ -2935,23 +2687,13 @@
                 <w:szCs w:val="24"/>
               </w:rPr>
             </w:pPr>
-            <w:proofErr w:type="gramStart"/>
-            <w:r>
-              <w:rPr>
-                <w:rFonts w:ascii="Times New Roman" w:hAnsi="Times New Roman" w:cs="Times New Roman"/>
-                <w:sz w:val="24"/>
-                <w:szCs w:val="24"/>
-              </w:rPr>
-              <w:t>Models</w:t>
-            </w:r>
-            <w:proofErr w:type="gramEnd"/>
-            <w:r>
-              <w:rPr>
-                <w:rFonts w:ascii="Times New Roman" w:hAnsi="Times New Roman" w:cs="Times New Roman"/>
-                <w:sz w:val="24"/>
-                <w:szCs w:val="24"/>
-              </w:rPr>
-              <w:t xml:space="preserve"> relationships between variables together with temporal dependencies.</w:t>
+            <w:r>
+              <w:rPr>
+                <w:rFonts w:ascii="Times New Roman" w:hAnsi="Times New Roman" w:cs="Times New Roman"/>
+                <w:sz w:val="24"/>
+                <w:szCs w:val="24"/>
+              </w:rPr>
+              <w:t>Models relationships between variables together with temporal dependencies.</w:t>
             </w:r>
           </w:p>
         </w:tc>
@@ -3881,25 +3623,7 @@
                 <w:sz w:val="24"/>
                 <w:szCs w:val="24"/>
               </w:rPr>
-              <w:t>“</w:t>
-            </w:r>
-            <w:proofErr w:type="spellStart"/>
-            <w:r>
-              <w:rPr>
-                <w:rFonts w:ascii="Times New Roman" w:hAnsi="Times New Roman" w:cs="Times New Roman"/>
-                <w:sz w:val="24"/>
-                <w:szCs w:val="24"/>
-              </w:rPr>
-              <w:t>TranAD</w:t>
-            </w:r>
-            <w:proofErr w:type="spellEnd"/>
-            <w:r>
-              <w:rPr>
-                <w:rFonts w:ascii="Times New Roman" w:hAnsi="Times New Roman" w:cs="Times New Roman"/>
-                <w:sz w:val="24"/>
-                <w:szCs w:val="24"/>
-              </w:rPr>
-              <w:t xml:space="preserve">: Deep Transformer Networks for Anomaly </w:t>
+              <w:t xml:space="preserve">“TranAD: Deep Transformer Networks for Anomaly </w:t>
             </w:r>
             <w:r>
               <w:rPr>
@@ -4131,25 +3855,7 @@
                 <w:sz w:val="24"/>
                 <w:szCs w:val="24"/>
               </w:rPr>
-              <w:t xml:space="preserve"> — </w:t>
-            </w:r>
-            <w:proofErr w:type="spellStart"/>
-            <w:r>
-              <w:rPr>
-                <w:rFonts w:ascii="Times New Roman" w:hAnsi="Times New Roman" w:cs="Times New Roman"/>
-                <w:sz w:val="24"/>
-                <w:szCs w:val="24"/>
-              </w:rPr>
-              <w:t>OpenReview</w:t>
-            </w:r>
-            <w:proofErr w:type="spellEnd"/>
-            <w:r>
-              <w:rPr>
-                <w:rFonts w:ascii="Times New Roman" w:hAnsi="Times New Roman" w:cs="Times New Roman"/>
-                <w:sz w:val="24"/>
-                <w:szCs w:val="24"/>
-              </w:rPr>
-              <w:t>/ICLR — Xu et al. (2022)</w:t>
+              <w:t xml:space="preserve"> — OpenReview/ICLR — Xu et al. (2022)</w:t>
             </w:r>
           </w:p>
         </w:tc>
@@ -4313,25 +4019,7 @@
                 <w:sz w:val="24"/>
                 <w:szCs w:val="24"/>
               </w:rPr>
-              <w:t xml:space="preserve"> — IEEE — </w:t>
-            </w:r>
-            <w:proofErr w:type="spellStart"/>
-            <w:r>
-              <w:rPr>
-                <w:rFonts w:ascii="Times New Roman" w:hAnsi="Times New Roman" w:cs="Times New Roman"/>
-                <w:sz w:val="24"/>
-                <w:szCs w:val="24"/>
-              </w:rPr>
-              <w:t>Kalakoti</w:t>
-            </w:r>
-            <w:proofErr w:type="spellEnd"/>
-            <w:r>
-              <w:rPr>
-                <w:rFonts w:ascii="Times New Roman" w:hAnsi="Times New Roman" w:cs="Times New Roman"/>
-                <w:sz w:val="24"/>
-                <w:szCs w:val="24"/>
-              </w:rPr>
-              <w:t xml:space="preserve"> et al. (2024)</w:t>
+              <w:t xml:space="preserve"> — IEEE — Kalakoti et al. (2024)</w:t>
             </w:r>
           </w:p>
         </w:tc>
@@ -4691,25 +4379,7 @@
                 <w:sz w:val="24"/>
                 <w:szCs w:val="24"/>
               </w:rPr>
-              <w:t>“XAI-</w:t>
-            </w:r>
-            <w:proofErr w:type="spellStart"/>
-            <w:r>
-              <w:rPr>
-                <w:rFonts w:ascii="Times New Roman" w:hAnsi="Times New Roman" w:cs="Times New Roman"/>
-                <w:sz w:val="24"/>
-                <w:szCs w:val="24"/>
-              </w:rPr>
-              <w:t>XGBoost</w:t>
-            </w:r>
-            <w:proofErr w:type="spellEnd"/>
-            <w:r>
-              <w:rPr>
-                <w:rFonts w:ascii="Times New Roman" w:hAnsi="Times New Roman" w:cs="Times New Roman"/>
-                <w:sz w:val="24"/>
-                <w:szCs w:val="24"/>
-              </w:rPr>
-              <w:t xml:space="preserve">: An Innovative Explainable Intrusion Detection Approach for Securing Internet of Medical Things Systems” — </w:t>
+              <w:t xml:space="preserve">“XAI-XGBoost: An Innovative Explainable Intrusion Detection Approach for Securing Internet of Medical Things Systems” — </w:t>
             </w:r>
             <w:r>
               <w:rPr>
@@ -4745,23 +4415,13 @@
                 <w:szCs w:val="24"/>
               </w:rPr>
             </w:pPr>
-            <w:proofErr w:type="spellStart"/>
-            <w:r>
-              <w:rPr>
-                <w:rFonts w:ascii="Times New Roman" w:hAnsi="Times New Roman" w:cs="Times New Roman"/>
-                <w:sz w:val="24"/>
-                <w:szCs w:val="24"/>
-              </w:rPr>
-              <w:t>XGBoost</w:t>
-            </w:r>
-            <w:proofErr w:type="spellEnd"/>
-            <w:r>
-              <w:rPr>
-                <w:rFonts w:ascii="Times New Roman" w:hAnsi="Times New Roman" w:cs="Times New Roman"/>
-                <w:sz w:val="24"/>
-                <w:szCs w:val="24"/>
-              </w:rPr>
-              <w:t>-based intrusion detection combined with explainable AI.</w:t>
+            <w:r>
+              <w:rPr>
+                <w:rFonts w:ascii="Times New Roman" w:hAnsi="Times New Roman" w:cs="Times New Roman"/>
+                <w:sz w:val="24"/>
+                <w:szCs w:val="24"/>
+              </w:rPr>
+              <w:t>XGBoost-based intrusion detection combined with explainable AI.</w:t>
             </w:r>
           </w:p>
         </w:tc>
@@ -5074,43 +4734,7 @@
                 <w:sz w:val="24"/>
                 <w:szCs w:val="24"/>
               </w:rPr>
-              <w:t xml:space="preserve"> — ACM — </w:t>
-            </w:r>
-            <w:proofErr w:type="spellStart"/>
-            <w:r>
-              <w:rPr>
-                <w:rFonts w:ascii="Times New Roman" w:hAnsi="Times New Roman" w:cs="Times New Roman"/>
-                <w:sz w:val="24"/>
-                <w:szCs w:val="24"/>
-              </w:rPr>
-              <w:t>Adohinzin</w:t>
-            </w:r>
-            <w:proofErr w:type="spellEnd"/>
-            <w:r>
-              <w:rPr>
-                <w:rFonts w:ascii="Times New Roman" w:hAnsi="Times New Roman" w:cs="Times New Roman"/>
-                <w:sz w:val="24"/>
-                <w:szCs w:val="24"/>
-              </w:rPr>
-              <w:t xml:space="preserve"> &amp; </w:t>
-            </w:r>
-            <w:proofErr w:type="spellStart"/>
-            <w:r>
-              <w:rPr>
-                <w:rFonts w:ascii="Times New Roman" w:hAnsi="Times New Roman" w:cs="Times New Roman"/>
-                <w:sz w:val="24"/>
-                <w:szCs w:val="24"/>
-              </w:rPr>
-              <w:t>Harrath</w:t>
-            </w:r>
-            <w:proofErr w:type="spellEnd"/>
-            <w:r>
-              <w:rPr>
-                <w:rFonts w:ascii="Times New Roman" w:hAnsi="Times New Roman" w:cs="Times New Roman"/>
-                <w:sz w:val="24"/>
-                <w:szCs w:val="24"/>
-              </w:rPr>
-              <w:t xml:space="preserve"> (2026)</w:t>
+              <w:t xml:space="preserve"> — ACM — Adohinzin &amp; Harrath (2026)</w:t>
             </w:r>
           </w:p>
         </w:tc>
@@ -5714,43 +5338,7 @@
           <w:sz w:val="24"/>
           <w:szCs w:val="24"/>
         </w:rPr>
-        <w:t xml:space="preserve">Insufficient cross-sensor physiological </w:t>
-      </w:r>
-      <w:proofErr w:type="spellStart"/>
-      <w:r>
-        <w:rPr>
-          <w:rFonts w:ascii="Times New Roman" w:hAnsi="Times New Roman" w:cs="Times New Roman"/>
-          <w:sz w:val="24"/>
-          <w:szCs w:val="24"/>
-        </w:rPr>
-        <w:t>modeling</w:t>
-      </w:r>
-      <w:proofErr w:type="spellEnd"/>
-      <w:r>
-        <w:rPr>
-          <w:rFonts w:ascii="Times New Roman" w:hAnsi="Times New Roman" w:cs="Times New Roman"/>
-          <w:sz w:val="24"/>
-          <w:szCs w:val="24"/>
-        </w:rPr>
-        <w:t xml:space="preserve">: GNN and spatial-temporal approaches have demonstrated the importance of </w:t>
-      </w:r>
-      <w:proofErr w:type="spellStart"/>
-      <w:r>
-        <w:rPr>
-          <w:rFonts w:ascii="Times New Roman" w:hAnsi="Times New Roman" w:cs="Times New Roman"/>
-          <w:sz w:val="24"/>
-          <w:szCs w:val="24"/>
-        </w:rPr>
-        <w:t>modeling</w:t>
-      </w:r>
-      <w:proofErr w:type="spellEnd"/>
-      <w:r>
-        <w:rPr>
-          <w:rFonts w:ascii="Times New Roman" w:hAnsi="Times New Roman" w:cs="Times New Roman"/>
-          <w:sz w:val="24"/>
-          <w:szCs w:val="24"/>
-        </w:rPr>
-        <w:t xml:space="preserve"> dependencies between multiple variables. However, most learn these relationships directly from data rather than incorporating clinically informed relationships among vital signs such as HR, SpO₂, blood pressure, and respiratory rate. </w:t>
+        <w:t xml:space="preserve">Insufficient cross-sensor physiological modeling: GNN and spatial-temporal approaches have demonstrated the importance of modeling dependencies between multiple variables. However, most learn these relationships directly from data rather than incorporating clinically informed relationships among vital signs such as HR, SpO₂, blood pressure, and respiratory rate. </w:t>
       </w:r>
     </w:p>
     <w:p>
@@ -5838,43 +5426,7 @@
           <w:sz w:val="24"/>
           <w:szCs w:val="24"/>
         </w:rPr>
-        <w:t xml:space="preserve">Need for explainable and generalizable detection: Recent IoMT security research emphasizes the importance of explainability, efficiency, and generalization. However, these aspects have not been sufficiently combined with physiology-aware coordinated FDI detection. Therefore, there is a clear opportunity for a Cross-Sensor Consistency </w:t>
-      </w:r>
-      <w:proofErr w:type="spellStart"/>
-      <w:r>
-        <w:rPr>
-          <w:rFonts w:ascii="Times New Roman" w:hAnsi="Times New Roman" w:cs="Times New Roman"/>
-          <w:sz w:val="24"/>
-          <w:szCs w:val="24"/>
-        </w:rPr>
-        <w:t>Modeling</w:t>
-      </w:r>
-      <w:proofErr w:type="spellEnd"/>
-      <w:r>
-        <w:rPr>
-          <w:rFonts w:ascii="Times New Roman" w:hAnsi="Times New Roman" w:cs="Times New Roman"/>
-          <w:sz w:val="24"/>
-          <w:szCs w:val="24"/>
-        </w:rPr>
-        <w:t xml:space="preserve"> (CSCM) framework that combines physiological relationships, graph-based learning, temporal information, coordinated attack </w:t>
-      </w:r>
-      <w:proofErr w:type="spellStart"/>
-      <w:r>
-        <w:rPr>
-          <w:rFonts w:ascii="Times New Roman" w:hAnsi="Times New Roman" w:cs="Times New Roman"/>
-          <w:sz w:val="24"/>
-          <w:szCs w:val="24"/>
-        </w:rPr>
-        <w:t>modeling</w:t>
-      </w:r>
-      <w:proofErr w:type="spellEnd"/>
-      <w:r>
-        <w:rPr>
-          <w:rFonts w:ascii="Times New Roman" w:hAnsi="Times New Roman" w:cs="Times New Roman"/>
-          <w:sz w:val="24"/>
-          <w:szCs w:val="24"/>
-        </w:rPr>
-        <w:t xml:space="preserve">, and explainability. </w:t>
+        <w:t xml:space="preserve">Need for explainable and generalizable detection: Recent IoMT security research emphasizes the importance of explainability, efficiency, and generalization. However, these aspects have not been sufficiently combined with physiology-aware coordinated FDI detection. Therefore, there is a clear opportunity for a Cross-Sensor Consistency Modeling (CSCM) framework that combines physiological relationships, graph-based learning, temporal information, coordinated attack modeling, and explainability. </w:t>
       </w:r>
     </w:p>
     <w:p>
@@ -6047,25 +5599,7 @@
           <w:sz w:val="24"/>
           <w:szCs w:val="24"/>
         </w:rPr>
-        <w:t xml:space="preserve">Public physiological datasets (PhysioNet/CinC-2012, WESAD, and MIMIC-III Waveform where accessible) are acquired and </w:t>
-      </w:r>
-      <w:proofErr w:type="spellStart"/>
-      <w:r>
-        <w:rPr>
-          <w:rFonts w:ascii="Times New Roman" w:hAnsi="Times New Roman" w:cs="Times New Roman"/>
-          <w:sz w:val="24"/>
-          <w:szCs w:val="24"/>
-        </w:rPr>
-        <w:t>preprocessed</w:t>
-      </w:r>
-      <w:proofErr w:type="spellEnd"/>
-      <w:r>
-        <w:rPr>
-          <w:rFonts w:ascii="Times New Roman" w:hAnsi="Times New Roman" w:cs="Times New Roman"/>
-          <w:sz w:val="24"/>
-          <w:szCs w:val="24"/>
-        </w:rPr>
-        <w:t xml:space="preserve"> — handling missing values, normalizing channels, and segmenting data into fixed-length time windows suitable for model input, using physiological variables appropriate to each dataset's available channels.</w:t>
+        <w:t>Public physiological datasets (PhysioNet/CinC-2012, WESAD, and MIMIC-III Waveform where accessible) are acquired and preprocessed — handling missing values, normalizing channels, and segmenting data into fixed-length time windows suitable for model input, using physiological variables appropriate to each dataset's available channels.</w:t>
       </w:r>
     </w:p>
     <w:p>
@@ -6241,25 +5775,7 @@
           <w:sz w:val="24"/>
           <w:szCs w:val="24"/>
         </w:rPr>
-        <w:t xml:space="preserve">The coordinated attack is run against the reproduced baseline detector to evaluate whether single-channel validation is vulnerable to coordinated, cross-channel manipulation. This evaluation constitutes an experimental result establishing the motivating evidence for the proposed </w:t>
-      </w:r>
-      <w:proofErr w:type="spellStart"/>
-      <w:r>
-        <w:rPr>
-          <w:rFonts w:ascii="Times New Roman" w:hAnsi="Times New Roman" w:cs="Times New Roman"/>
-          <w:sz w:val="24"/>
-          <w:szCs w:val="24"/>
-        </w:rPr>
-        <w:t>defense</w:t>
-      </w:r>
-      <w:proofErr w:type="spellEnd"/>
-      <w:r>
-        <w:rPr>
-          <w:rFonts w:ascii="Times New Roman" w:hAnsi="Times New Roman" w:cs="Times New Roman"/>
-          <w:sz w:val="24"/>
-          <w:szCs w:val="24"/>
-        </w:rPr>
-        <w:t>, rather than an assumed outcome.</w:t>
+        <w:t>The coordinated attack is run against the reproduced baseline detector to evaluate whether single-channel validation is vulnerable to coordinated, cross-channel manipulation. This evaluation constitutes an experimental result establishing the motivating evidence for the proposed defense, rather than an assumed outcome.</w:t>
       </w:r>
     </w:p>
     <w:p>
@@ -6284,29 +5800,7 @@
           <w:sz w:val="24"/>
           <w:szCs w:val="24"/>
         </w:rPr>
-        <w:t xml:space="preserve">Proposed </w:t>
-      </w:r>
-      <w:proofErr w:type="spellStart"/>
-      <w:r>
-        <w:rPr>
-          <w:rFonts w:ascii="Times New Roman" w:hAnsi="Times New Roman" w:cs="Times New Roman"/>
-          <w:b/>
-          <w:bCs/>
-          <w:sz w:val="24"/>
-          <w:szCs w:val="24"/>
-        </w:rPr>
-        <w:t>Defense</w:t>
-      </w:r>
-      <w:proofErr w:type="spellEnd"/>
-      <w:r>
-        <w:rPr>
-          <w:rFonts w:ascii="Times New Roman" w:hAnsi="Times New Roman" w:cs="Times New Roman"/>
-          <w:b/>
-          <w:bCs/>
-          <w:sz w:val="24"/>
-          <w:szCs w:val="24"/>
-        </w:rPr>
-        <w:t xml:space="preserve"> Design and Implementation</w:t>
+        <w:t>Proposed Defense Design and Implementation</w:t>
       </w:r>
       <w:r>
         <w:rPr>
@@ -6333,25 +5827,7 @@
           <w:sz w:val="24"/>
           <w:szCs w:val="24"/>
         </w:rPr>
-        <w:t xml:space="preserve">The Cross-Sensor Consistency </w:t>
-      </w:r>
-      <w:proofErr w:type="spellStart"/>
-      <w:r>
-        <w:rPr>
-          <w:rFonts w:ascii="Times New Roman" w:hAnsi="Times New Roman" w:cs="Times New Roman"/>
-          <w:sz w:val="24"/>
-          <w:szCs w:val="24"/>
-        </w:rPr>
-        <w:t>Modeling</w:t>
-      </w:r>
-      <w:proofErr w:type="spellEnd"/>
-      <w:r>
-        <w:rPr>
-          <w:rFonts w:ascii="Times New Roman" w:hAnsi="Times New Roman" w:cs="Times New Roman"/>
-          <w:sz w:val="24"/>
-          <w:szCs w:val="24"/>
-        </w:rPr>
-        <w:t xml:space="preserve"> (CSCM) framework is designed and implemented, using a graph attention network built over a physiologically informed channel relationship graph to jointly evaluate consistency across multiple vital-sign channels.</w:t>
+        <w:t>The Cross-Sensor Consistency Modeling (CSCM) framework is designed and implemented, using a graph attention network built over a physiologically informed channel relationship graph to jointly evaluate consistency across multiple vital-sign channels.</w:t>
       </w:r>
     </w:p>
     <w:p>
@@ -6403,25 +5879,7 @@
           <w:sz w:val="24"/>
           <w:szCs w:val="24"/>
         </w:rPr>
-        <w:t xml:space="preserve">The CSCM framework is trained on </w:t>
-      </w:r>
-      <w:proofErr w:type="spellStart"/>
-      <w:r>
-        <w:rPr>
-          <w:rFonts w:ascii="Times New Roman" w:hAnsi="Times New Roman" w:cs="Times New Roman"/>
-          <w:sz w:val="24"/>
-          <w:szCs w:val="24"/>
-        </w:rPr>
-        <w:t>labeled</w:t>
-      </w:r>
-      <w:proofErr w:type="spellEnd"/>
-      <w:r>
-        <w:rPr>
-          <w:rFonts w:ascii="Times New Roman" w:hAnsi="Times New Roman" w:cs="Times New Roman"/>
-          <w:sz w:val="24"/>
-          <w:szCs w:val="24"/>
-        </w:rPr>
-        <w:t xml:space="preserve"> data comprising normal readings, single-channel attacks, and coordinated multi-channel attacks, using appropriate train/validation/test splits. The test set is constructed to include attack instances and channel combinations not seen during training, ensuring that the evaluation reflects the model's ability to generalize to unseen coordinated attack patterns rather than memorized combinations.</w:t>
+        <w:t>The CSCM framework is trained on labeled data comprising normal readings, single-channel attacks, and coordinated multi-channel attacks, using appropriate train/validation/test splits. The test set is constructed to include attack instances and channel combinations not seen during training, ensuring that the evaluation reflects the model's ability to generalize to unseen coordinated attack patterns rather than memorized combinations.</w:t>
       </w:r>
     </w:p>
     <w:p>
@@ -6917,25 +6375,7 @@
                 <w:sz w:val="24"/>
                 <w:szCs w:val="24"/>
               </w:rPr>
-              <w:t xml:space="preserve">The system shall implement and train the proposed Cross-Sensor Consistency </w:t>
-            </w:r>
-            <w:proofErr w:type="spellStart"/>
-            <w:r>
-              <w:rPr>
-                <w:rFonts w:ascii="Times New Roman" w:hAnsi="Times New Roman" w:cs="Times New Roman"/>
-                <w:sz w:val="24"/>
-                <w:szCs w:val="24"/>
-              </w:rPr>
-              <w:t>Modeling</w:t>
-            </w:r>
-            <w:proofErr w:type="spellEnd"/>
-            <w:r>
-              <w:rPr>
-                <w:rFonts w:ascii="Times New Roman" w:hAnsi="Times New Roman" w:cs="Times New Roman"/>
-                <w:sz w:val="24"/>
-                <w:szCs w:val="24"/>
-              </w:rPr>
-              <w:t xml:space="preserve"> (CSCM) framework using a physiology-informed graph attention mechanism with appropriate train, validation, and test partitions.</w:t>
+              <w:t>The system shall implement and train the proposed Cross-Sensor Consistency Modeling (CSCM) framework using a physiology-informed graph attention mechanism with appropriate train, validation, and test partitions.</w:t>
             </w:r>
           </w:p>
         </w:tc>
@@ -7223,25 +6663,7 @@
                 <w:sz w:val="24"/>
                 <w:szCs w:val="24"/>
               </w:rPr>
-              <w:t xml:space="preserve"> — The system shall operate within available computing resources such as Google </w:t>
-            </w:r>
-            <w:proofErr w:type="spellStart"/>
-            <w:r>
-              <w:rPr>
-                <w:rFonts w:ascii="Times New Roman" w:hAnsi="Times New Roman" w:cs="Times New Roman"/>
-                <w:sz w:val="24"/>
-                <w:szCs w:val="24"/>
-              </w:rPr>
-              <w:t>Colab</w:t>
-            </w:r>
-            <w:proofErr w:type="spellEnd"/>
-            <w:r>
-              <w:rPr>
-                <w:rFonts w:ascii="Times New Roman" w:hAnsi="Times New Roman" w:cs="Times New Roman"/>
-                <w:sz w:val="24"/>
-                <w:szCs w:val="24"/>
-              </w:rPr>
-              <w:t xml:space="preserve"> or a standard local machine with reasonable execution time.</w:t>
+              <w:t xml:space="preserve"> — The system shall operate within available computing resources such as Google Colab or a standard local machine with reasonable execution time.</w:t>
             </w:r>
           </w:p>
         </w:tc>
@@ -7883,20 +7305,12 @@
       <w:pPr>
         <w:rPr>
           <w:rFonts w:ascii="Times New Roman" w:hAnsi="Times New Roman" w:cs="Times New Roman"/>
-          <w:sz w:val="24"/>
-          <w:szCs w:val="24"/>
-        </w:rPr>
-      </w:pPr>
-      <w:r>
-        <w:rPr>
-          <w:rFonts w:ascii="Times New Roman" w:hAnsi="Times New Roman" w:cs="Times New Roman"/>
           <w:b/>
           <w:bCs/>
           <w:sz w:val="24"/>
           <w:szCs w:val="24"/>
         </w:rPr>
-        <w:t xml:space="preserve">[11] </w:t>
-      </w:r>
+      </w:pPr>
       <w:r>
         <w:rPr>
           <w:rFonts w:ascii="Times New Roman" w:hAnsi="Times New Roman" w:cs="Times New Roman"/>
@@ -7905,6 +7319,910 @@
           <w:sz w:val="24"/>
           <w:szCs w:val="24"/>
         </w:rPr>
+        <w:t>[11] IMPLEMENTATION:</w:t>
+      </w:r>
+    </w:p>
+    <w:p>
+      <w:pPr>
+        <w:rPr>
+          <w:rFonts w:ascii="Times New Roman" w:hAnsi="Times New Roman" w:cs="Times New Roman"/>
+          <w:b/>
+          <w:bCs/>
+          <w:sz w:val="24"/>
+          <w:szCs w:val="24"/>
+        </w:rPr>
+      </w:pPr>
+      <w:r>
+        <w:rPr>
+          <w:rFonts w:ascii="Times New Roman" w:hAnsi="Times New Roman" w:cs="Times New Roman"/>
+          <w:b/>
+          <w:bCs/>
+          <w:sz w:val="24"/>
+          <w:szCs w:val="24"/>
+        </w:rPr>
+        <w:t>11.1 PROJECT PLAN</w:t>
+      </w:r>
+    </w:p>
+    <w:p>
+      <w:pPr>
+        <w:jc w:val="both"/>
+        <w:rPr>
+          <w:rFonts w:ascii="Times New Roman" w:hAnsi="Times New Roman" w:cs="Times New Roman"/>
+          <w:sz w:val="24"/>
+          <w:szCs w:val="24"/>
+        </w:rPr>
+      </w:pPr>
+      <w:r>
+        <w:rPr>
+          <w:rFonts w:ascii="Times New Roman" w:hAnsi="Times New Roman" w:cs="Times New Roman"/>
+          <w:sz w:val="24"/>
+          <w:szCs w:val="24"/>
+        </w:rPr>
+        <w:t>The development and execution of the CSCM-IoMT project were structured into a rigorous nine-phase implementation plan to systematically build and evaluate the detection architectures:</w:t>
+      </w:r>
+    </w:p>
+    <w:p>
+      <w:pPr>
+        <w:numPr>
+          <w:ilvl w:val="0"/>
+          <w:numId w:val="17"/>
+        </w:numPr>
+        <w:jc w:val="both"/>
+        <w:rPr>
+          <w:rFonts w:ascii="Times New Roman" w:hAnsi="Times New Roman" w:cs="Times New Roman"/>
+          <w:sz w:val="24"/>
+          <w:szCs w:val="24"/>
+        </w:rPr>
+      </w:pPr>
+      <w:r>
+        <w:rPr>
+          <w:rFonts w:ascii="Times New Roman" w:hAnsi="Times New Roman" w:cs="Times New Roman"/>
+          <w:sz w:val="24"/>
+          <w:szCs w:val="24"/>
+        </w:rPr>
+        <w:t>Phase 1 (Environment Setup): Configuration of the deep learning environment and dataset acquisition.</w:t>
+      </w:r>
+    </w:p>
+    <w:p>
+      <w:pPr>
+        <w:numPr>
+          <w:ilvl w:val="0"/>
+          <w:numId w:val="17"/>
+        </w:numPr>
+        <w:jc w:val="both"/>
+        <w:rPr>
+          <w:rFonts w:ascii="Times New Roman" w:hAnsi="Times New Roman" w:cs="Times New Roman"/>
+          <w:sz w:val="24"/>
+          <w:szCs w:val="24"/>
+        </w:rPr>
+      </w:pPr>
+      <w:r>
+        <w:rPr>
+          <w:rFonts w:ascii="Times New Roman" w:hAnsi="Times New Roman" w:cs="Times New Roman"/>
+          <w:sz w:val="24"/>
+          <w:szCs w:val="24"/>
+        </w:rPr>
+        <w:t>Phase 2 (Dataset Audit): Extensive parsing and temporal auditing of PhysioNet/CinC-2012 and WESAD records to ensure data integrity.</w:t>
+      </w:r>
+    </w:p>
+    <w:p>
+      <w:pPr>
+        <w:numPr>
+          <w:ilvl w:val="0"/>
+          <w:numId w:val="17"/>
+        </w:numPr>
+        <w:jc w:val="both"/>
+        <w:rPr>
+          <w:rFonts w:ascii="Times New Roman" w:hAnsi="Times New Roman" w:cs="Times New Roman"/>
+          <w:sz w:val="24"/>
+          <w:szCs w:val="24"/>
+        </w:rPr>
+      </w:pPr>
+      <w:r>
+        <w:rPr>
+          <w:rFonts w:ascii="Times New Roman" w:hAnsi="Times New Roman" w:cs="Times New Roman"/>
+          <w:sz w:val="24"/>
+          <w:szCs w:val="24"/>
+        </w:rPr>
+        <w:t>Phase 3 (Preprocessing): Implementation of temporal alignment, resampling, missing-value imputation (forward fill), and train-only normalization.</w:t>
+      </w:r>
+    </w:p>
+    <w:p>
+      <w:pPr>
+        <w:numPr>
+          <w:ilvl w:val="0"/>
+          <w:numId w:val="17"/>
+        </w:numPr>
+        <w:jc w:val="both"/>
+        <w:rPr>
+          <w:rFonts w:ascii="Times New Roman" w:hAnsi="Times New Roman" w:cs="Times New Roman"/>
+          <w:sz w:val="24"/>
+          <w:szCs w:val="24"/>
+        </w:rPr>
+      </w:pPr>
+      <w:r>
+        <w:rPr>
+          <w:rFonts w:ascii="Times New Roman" w:hAnsi="Times New Roman" w:cs="Times New Roman"/>
+          <w:sz w:val="24"/>
+          <w:szCs w:val="24"/>
+        </w:rPr>
+        <w:t>Phase 4 (Synthetic FDI Generation): Engineering a deterministic pipeline to inject additive, multiplicative, drift, and coordinated multi-channel FDI attacks under controlled severity and physiological plausibility constraints.</w:t>
+      </w:r>
+    </w:p>
+    <w:p>
+      <w:pPr>
+        <w:numPr>
+          <w:ilvl w:val="0"/>
+          <w:numId w:val="17"/>
+        </w:numPr>
+        <w:jc w:val="both"/>
+        <w:rPr>
+          <w:rFonts w:ascii="Times New Roman" w:hAnsi="Times New Roman" w:cs="Times New Roman"/>
+          <w:sz w:val="24"/>
+          <w:szCs w:val="24"/>
+        </w:rPr>
+      </w:pPr>
+      <w:r>
+        <w:rPr>
+          <w:rFonts w:ascii="Times New Roman" w:hAnsi="Times New Roman" w:cs="Times New Roman"/>
+          <w:sz w:val="24"/>
+          <w:szCs w:val="24"/>
+        </w:rPr>
+        <w:t>Phase 5 (Baseline Mode</w:t>
+      </w:r>
+      <w:r>
+        <w:rPr>
+          <w:rFonts w:ascii="Times New Roman" w:hAnsi="Times New Roman" w:cs="Times New Roman"/>
+          <w:sz w:val="24"/>
+          <w:szCs w:val="24"/>
+        </w:rPr>
+        <w:t>l</w:t>
+      </w:r>
+      <w:r>
+        <w:rPr>
+          <w:rFonts w:ascii="Times New Roman" w:hAnsi="Times New Roman" w:cs="Times New Roman"/>
+          <w:sz w:val="24"/>
+          <w:szCs w:val="24"/>
+        </w:rPr>
+        <w:t>ling): Training independent single-channel detection models to establish a baseline for comparison against coordinated multi-channel attack detection.</w:t>
+      </w:r>
+    </w:p>
+    <w:p>
+      <w:pPr>
+        <w:numPr>
+          <w:ilvl w:val="0"/>
+          <w:numId w:val="17"/>
+        </w:numPr>
+        <w:jc w:val="both"/>
+        <w:rPr>
+          <w:rFonts w:ascii="Times New Roman" w:hAnsi="Times New Roman" w:cs="Times New Roman"/>
+          <w:sz w:val="24"/>
+          <w:szCs w:val="24"/>
+        </w:rPr>
+      </w:pPr>
+      <w:r>
+        <w:rPr>
+          <w:rFonts w:ascii="Times New Roman" w:hAnsi="Times New Roman" w:cs="Times New Roman"/>
+          <w:sz w:val="24"/>
+          <w:szCs w:val="24"/>
+        </w:rPr>
+        <w:lastRenderedPageBreak/>
+        <w:t>Phase 6 (CSCM Architecture): Implementation of the Cross-Sensor Consistency Mode</w:t>
+      </w:r>
+      <w:r>
+        <w:rPr>
+          <w:rFonts w:ascii="Times New Roman" w:hAnsi="Times New Roman" w:cs="Times New Roman"/>
+          <w:sz w:val="24"/>
+          <w:szCs w:val="24"/>
+        </w:rPr>
+        <w:t>l</w:t>
+      </w:r>
+      <w:r>
+        <w:rPr>
+          <w:rFonts w:ascii="Times New Roman" w:hAnsi="Times New Roman" w:cs="Times New Roman"/>
+          <w:sz w:val="24"/>
+          <w:szCs w:val="24"/>
+        </w:rPr>
+        <w:t>ling (CSCM) framework using temporal feature extraction, a physiology-informed channel graph, graph-based message passing, and explicit pairwise representation features.</w:t>
+      </w:r>
+    </w:p>
+    <w:p>
+      <w:pPr>
+        <w:numPr>
+          <w:ilvl w:val="0"/>
+          <w:numId w:val="17"/>
+        </w:numPr>
+        <w:jc w:val="both"/>
+        <w:rPr>
+          <w:rFonts w:ascii="Times New Roman" w:hAnsi="Times New Roman" w:cs="Times New Roman"/>
+          <w:sz w:val="24"/>
+          <w:szCs w:val="24"/>
+        </w:rPr>
+      </w:pPr>
+      <w:r>
+        <w:rPr>
+          <w:rFonts w:ascii="Times New Roman" w:hAnsi="Times New Roman" w:cs="Times New Roman"/>
+          <w:sz w:val="24"/>
+          <w:szCs w:val="24"/>
+        </w:rPr>
+        <w:t>Phase 7 (Architectural Ablation): Controlled comparison of the naive multi-channel model, graph-only message passing model, and full CSCM model to determine whether explicit pairwise representation features provide additional benefit beyond graph-based interaction.</w:t>
+      </w:r>
+    </w:p>
+    <w:p>
+      <w:pPr>
+        <w:numPr>
+          <w:ilvl w:val="0"/>
+          <w:numId w:val="17"/>
+        </w:numPr>
+        <w:jc w:val="both"/>
+        <w:rPr>
+          <w:rFonts w:ascii="Times New Roman" w:hAnsi="Times New Roman" w:cs="Times New Roman"/>
+          <w:sz w:val="24"/>
+          <w:szCs w:val="24"/>
+        </w:rPr>
+      </w:pPr>
+      <w:r>
+        <w:rPr>
+          <w:rFonts w:ascii="Times New Roman" w:hAnsi="Times New Roman" w:cs="Times New Roman"/>
+          <w:sz w:val="24"/>
+          <w:szCs w:val="24"/>
+        </w:rPr>
+        <w:t>Phase 8 (Statistical Analysis): Evaluation of model differences using hierarchical paired bootstrap resampling at the RecordID level for PhysioNet and SubjectID level for WESAD, together with supplementary McNemar analysis.</w:t>
+      </w:r>
+    </w:p>
+    <w:p>
+      <w:pPr>
+        <w:numPr>
+          <w:ilvl w:val="0"/>
+          <w:numId w:val="17"/>
+        </w:numPr>
+        <w:jc w:val="both"/>
+        <w:rPr>
+          <w:rFonts w:ascii="Times New Roman" w:hAnsi="Times New Roman" w:cs="Times New Roman"/>
+          <w:sz w:val="24"/>
+          <w:szCs w:val="24"/>
+        </w:rPr>
+      </w:pPr>
+      <w:r>
+        <w:rPr>
+          <w:rFonts w:ascii="Times New Roman" w:hAnsi="Times New Roman" w:cs="Times New Roman"/>
+          <w:sz w:val="24"/>
+          <w:szCs w:val="24"/>
+        </w:rPr>
+        <w:t>Phase 9 (Final Consolidation): Granular error analysis and generation of final visualizations.</w:t>
+      </w:r>
+    </w:p>
+    <w:p>
+      <w:pPr>
+        <w:rPr>
+          <w:rFonts w:ascii="Times New Roman" w:hAnsi="Times New Roman" w:cs="Times New Roman"/>
+          <w:b/>
+          <w:bCs/>
+          <w:sz w:val="24"/>
+          <w:szCs w:val="24"/>
+        </w:rPr>
+      </w:pPr>
+      <w:r>
+        <w:rPr>
+          <w:rFonts w:ascii="Times New Roman" w:hAnsi="Times New Roman" w:cs="Times New Roman"/>
+          <w:b/>
+          <w:bCs/>
+          <w:sz w:val="24"/>
+          <w:szCs w:val="24"/>
+        </w:rPr>
+        <w:t>11.2 SAMPLE CODE</w:t>
+      </w:r>
+    </w:p>
+    <w:p>
+      <w:pPr>
+        <w:rPr>
+          <w:rFonts w:ascii="Times New Roman" w:hAnsi="Times New Roman" w:cs="Times New Roman"/>
+          <w:b/>
+          <w:bCs/>
+          <w:sz w:val="24"/>
+          <w:szCs w:val="24"/>
+        </w:rPr>
+      </w:pPr>
+      <w:r>
+        <w:rPr>
+          <w:rFonts w:ascii="Times New Roman" w:hAnsi="Times New Roman" w:cs="Times New Roman"/>
+          <w:b/>
+          <w:bCs/>
+          <w:sz w:val="24"/>
+          <w:szCs w:val="24"/>
+        </w:rPr>
+        <w:t>11.3 TESTING STRATEGIES</w:t>
+      </w:r>
+    </w:p>
+    <w:p>
+      <w:pPr>
+        <w:jc w:val="both"/>
+        <w:rPr>
+          <w:rFonts w:ascii="Times New Roman" w:hAnsi="Times New Roman" w:cs="Times New Roman"/>
+          <w:sz w:val="24"/>
+          <w:szCs w:val="24"/>
+        </w:rPr>
+      </w:pPr>
+      <w:r>
+        <w:rPr>
+          <w:rFonts w:ascii="Times New Roman" w:hAnsi="Times New Roman" w:cs="Times New Roman"/>
+          <w:sz w:val="24"/>
+          <w:szCs w:val="24"/>
+        </w:rPr>
+        <w:t>To guarantee the reliability of the anomaly detection pipeline, comprehensive testing strategies were integrated throughout the project lifecycle:</w:t>
+      </w:r>
+    </w:p>
+    <w:p>
+      <w:pPr>
+        <w:numPr>
+          <w:ilvl w:val="0"/>
+          <w:numId w:val="18"/>
+        </w:numPr>
+        <w:jc w:val="both"/>
+        <w:rPr>
+          <w:rFonts w:ascii="Times New Roman" w:hAnsi="Times New Roman" w:cs="Times New Roman"/>
+          <w:sz w:val="24"/>
+          <w:szCs w:val="24"/>
+        </w:rPr>
+      </w:pPr>
+      <w:r>
+        <w:rPr>
+          <w:rFonts w:ascii="Times New Roman" w:hAnsi="Times New Roman" w:cs="Times New Roman"/>
+          <w:sz w:val="24"/>
+          <w:szCs w:val="24"/>
+        </w:rPr>
+        <w:t>Unit Testing: Automated unit tests utilizing the pytest framework were implemented to validate data loaders and configuration parsing.</w:t>
+      </w:r>
+    </w:p>
+    <w:p>
+      <w:pPr>
+        <w:numPr>
+          <w:ilvl w:val="0"/>
+          <w:numId w:val="18"/>
+        </w:numPr>
+        <w:jc w:val="both"/>
+        <w:rPr>
+          <w:rFonts w:ascii="Times New Roman" w:hAnsi="Times New Roman" w:cs="Times New Roman"/>
+          <w:sz w:val="24"/>
+          <w:szCs w:val="24"/>
+        </w:rPr>
+      </w:pPr>
+      <w:r>
+        <w:rPr>
+          <w:rFonts w:ascii="Times New Roman" w:hAnsi="Times New Roman" w:cs="Times New Roman"/>
+          <w:sz w:val="24"/>
+          <w:szCs w:val="24"/>
+        </w:rPr>
+        <w:t>Dataset Integrity Testing: Pre-computation audits ensured records were properly loaded and isolated correctly by unique patient/subject identifiers.</w:t>
+      </w:r>
+    </w:p>
+    <w:p>
+      <w:pPr>
+        <w:numPr>
+          <w:ilvl w:val="0"/>
+          <w:numId w:val="18"/>
+        </w:numPr>
+        <w:jc w:val="both"/>
+        <w:rPr>
+          <w:rFonts w:ascii="Times New Roman" w:hAnsi="Times New Roman" w:cs="Times New Roman"/>
+          <w:sz w:val="24"/>
+          <w:szCs w:val="24"/>
+        </w:rPr>
+      </w:pPr>
+      <w:r>
+        <w:rPr>
+          <w:rFonts w:ascii="Times New Roman" w:hAnsi="Times New Roman" w:cs="Times New Roman"/>
+          <w:sz w:val="24"/>
+          <w:szCs w:val="24"/>
+        </w:rPr>
+        <w:t>Attack Validation: The attack generation pipeline dynamically validated that all synthetic FDI manipulations strictly adhered to defined global physiological plausibility constraints.</w:t>
+      </w:r>
+    </w:p>
+    <w:p>
+      <w:pPr>
+        <w:numPr>
+          <w:ilvl w:val="0"/>
+          <w:numId w:val="18"/>
+        </w:numPr>
+        <w:jc w:val="both"/>
+        <w:rPr>
+          <w:rFonts w:ascii="Times New Roman" w:hAnsi="Times New Roman" w:cs="Times New Roman"/>
+          <w:sz w:val="24"/>
+          <w:szCs w:val="24"/>
+        </w:rPr>
+      </w:pPr>
+      <w:r>
+        <w:rPr>
+          <w:rFonts w:ascii="Times New Roman" w:hAnsi="Times New Roman" w:cs="Times New Roman"/>
+          <w:sz w:val="24"/>
+          <w:szCs w:val="24"/>
+        </w:rPr>
+        <w:t>Reproducibility: Random operations were controlled using fixed random seeds. Final experiments were repeated using seeds 42, 123, and 2024 to test robustness against initialization variance.</w:t>
+      </w:r>
+    </w:p>
+    <w:p>
+      <w:pPr>
+        <w:numPr>
+          <w:ilvl w:val="0"/>
+          <w:numId w:val="18"/>
+        </w:numPr>
+        <w:jc w:val="both"/>
+        <w:rPr>
+          <w:rFonts w:ascii="Times New Roman" w:hAnsi="Times New Roman" w:cs="Times New Roman"/>
+          <w:sz w:val="24"/>
+          <w:szCs w:val="24"/>
+        </w:rPr>
+      </w:pPr>
+      <w:r>
+        <w:rPr>
+          <w:rFonts w:ascii="Times New Roman" w:hAnsi="Times New Roman" w:cs="Times New Roman"/>
+          <w:sz w:val="24"/>
+          <w:szCs w:val="24"/>
+        </w:rPr>
+        <w:t>Train/Validation/Test Leakage Checks: Normalization parameters (mean/std) were computed exclusively on the designated training split before being strictly applied to the validation and test splits.</w:t>
+      </w:r>
+    </w:p>
+    <w:p>
+      <w:pPr>
+        <w:numPr>
+          <w:ilvl w:val="0"/>
+          <w:numId w:val="18"/>
+        </w:numPr>
+        <w:jc w:val="both"/>
+        <w:rPr>
+          <w:rFonts w:ascii="Times New Roman" w:hAnsi="Times New Roman" w:cs="Times New Roman"/>
+          <w:sz w:val="24"/>
+          <w:szCs w:val="24"/>
+        </w:rPr>
+      </w:pPr>
+      <w:r>
+        <w:rPr>
+          <w:rFonts w:ascii="Times New Roman" w:hAnsi="Times New Roman" w:cs="Times New Roman"/>
+          <w:sz w:val="24"/>
+          <w:szCs w:val="24"/>
+        </w:rPr>
+        <w:t>Threshold Calibration: Classification thresholds for discrete binary predictions were dynamically optimized strictly on the isolated validation splits to prevent test-set leakage.</w:t>
+      </w:r>
+    </w:p>
+    <w:p>
+      <w:pPr>
+        <w:numPr>
+          <w:ilvl w:val="0"/>
+          <w:numId w:val="18"/>
+        </w:numPr>
+        <w:jc w:val="both"/>
+        <w:rPr>
+          <w:rFonts w:ascii="Times New Roman" w:hAnsi="Times New Roman" w:cs="Times New Roman"/>
+          <w:sz w:val="24"/>
+          <w:szCs w:val="24"/>
+        </w:rPr>
+      </w:pPr>
+      <w:r>
+        <w:rPr>
+          <w:rFonts w:ascii="Times New Roman" w:hAnsi="Times New Roman" w:cs="Times New Roman"/>
+          <w:sz w:val="24"/>
+          <w:szCs w:val="24"/>
+        </w:rPr>
+        <w:t>Statistical Validation: Model differences were rigorously evaluated via hierarchical paired bootstrapping at the RecordID level for PhysioNet and SubjectID level for WESAD to ensure differences were statistically meaningful and accounted for intra-patient correlation.</w:t>
+      </w:r>
+    </w:p>
+    <w:p>
+      <w:pPr>
+        <w:rPr>
+          <w:rFonts w:ascii="Times New Roman" w:hAnsi="Times New Roman" w:cs="Times New Roman"/>
+          <w:b/>
+          <w:bCs/>
+          <w:sz w:val="24"/>
+          <w:szCs w:val="24"/>
+        </w:rPr>
+      </w:pPr>
+    </w:p>
+    <w:p>
+      <w:pPr>
+        <w:rPr>
+          <w:rFonts w:ascii="Times New Roman" w:hAnsi="Times New Roman" w:cs="Times New Roman"/>
+          <w:b/>
+          <w:bCs/>
+          <w:sz w:val="24"/>
+          <w:szCs w:val="24"/>
+        </w:rPr>
+      </w:pPr>
+      <w:r>
+        <w:rPr>
+          <w:rFonts w:ascii="Times New Roman" w:hAnsi="Times New Roman" w:cs="Times New Roman"/>
+          <w:b/>
+          <w:bCs/>
+          <w:sz w:val="24"/>
+          <w:szCs w:val="24"/>
+        </w:rPr>
+        <w:lastRenderedPageBreak/>
+        <w:t>11.4 SAMPLE SCREENSHOTS</w:t>
+      </w:r>
+    </w:p>
+    <w:p>
+      <w:pPr>
+        <w:rPr>
+          <w:rFonts w:ascii="Times New Roman" w:hAnsi="Times New Roman" w:cs="Times New Roman"/>
+          <w:b/>
+          <w:bCs/>
+          <w:sz w:val="24"/>
+          <w:szCs w:val="24"/>
+        </w:rPr>
+      </w:pPr>
+      <w:r>
+        <w:rPr>
+          <w:rFonts w:ascii="Times New Roman" w:hAnsi="Times New Roman" w:cs="Times New Roman"/>
+          <w:b/>
+          <w:bCs/>
+          <w:sz w:val="24"/>
+          <w:szCs w:val="24"/>
+        </w:rPr>
+        <w:drawing>
+          <wp:inline distT="0" distB="0" distL="0" distR="0" wp14:anchorId="4445FBFD" wp14:editId="666B7923">
+            <wp:extent cx="5734050" cy="2853055"/>
+            <wp:effectExtent l="0" t="0" r="0" b="4445"/>
+            <wp:docPr id="1412003325" name="Picture 1"/>
+            <wp:cNvGraphicFramePr>
+              <a:graphicFrameLocks xmlns:a="http://schemas.openxmlformats.org/drawingml/2006/main" noChangeAspect="1"/>
+            </wp:cNvGraphicFramePr>
+            <a:graphic xmlns:a="http://schemas.openxmlformats.org/drawingml/2006/main">
+              <a:graphicData uri="http://schemas.openxmlformats.org/drawingml/2006/picture">
+                <pic:pic xmlns:pic="http://schemas.openxmlformats.org/drawingml/2006/picture">
+                  <pic:nvPicPr>
+                    <pic:cNvPr id="1412003325" name=""/>
+                    <pic:cNvPicPr/>
+                  </pic:nvPicPr>
+                  <pic:blipFill>
+                    <a:blip r:embed="rId12"/>
+                    <a:stretch>
+                      <a:fillRect/>
+                    </a:stretch>
+                  </pic:blipFill>
+                  <pic:spPr>
+                    <a:xfrm>
+                      <a:off x="0" y="0"/>
+                      <a:ext cx="5734050" cy="2853055"/>
+                    </a:xfrm>
+                    <a:prstGeom prst="rect">
+                      <a:avLst/>
+                    </a:prstGeom>
+                  </pic:spPr>
+                </pic:pic>
+              </a:graphicData>
+            </a:graphic>
+          </wp:inline>
+        </w:drawing>
+      </w:r>
+      <w:r>
+        <w:rPr>
+          <w:rFonts w:ascii="Times New Roman" w:hAnsi="Times New Roman" w:cs="Times New Roman"/>
+          <w:b/>
+          <w:bCs/>
+          <w:sz w:val="24"/>
+          <w:szCs w:val="24"/>
+        </w:rPr>
+        <w:t xml:space="preserve"> </w:t>
+      </w:r>
+    </w:p>
+    <w:p>
+      <w:pPr>
+        <w:rPr>
+          <w:rFonts w:ascii="Times New Roman" w:hAnsi="Times New Roman" w:cs="Times New Roman"/>
+          <w:b/>
+          <w:bCs/>
+          <w:sz w:val="24"/>
+          <w:szCs w:val="24"/>
+        </w:rPr>
+      </w:pPr>
+      <w:r>
+        <w:rPr>
+          <w:rFonts w:ascii="Times New Roman" w:hAnsi="Times New Roman" w:cs="Times New Roman"/>
+          <w:b/>
+          <w:bCs/>
+          <w:sz w:val="24"/>
+          <w:szCs w:val="24"/>
+        </w:rPr>
+        <w:drawing>
+          <wp:inline distT="0" distB="0" distL="0" distR="0" wp14:anchorId="5F192178" wp14:editId="6225E6E3">
+            <wp:extent cx="5730737" cy="5235394"/>
+            <wp:effectExtent l="0" t="0" r="3810" b="3810"/>
+            <wp:docPr id="607023145" name="Picture 1"/>
+            <wp:cNvGraphicFramePr>
+              <a:graphicFrameLocks xmlns:a="http://schemas.openxmlformats.org/drawingml/2006/main" noChangeAspect="1"/>
+            </wp:cNvGraphicFramePr>
+            <a:graphic xmlns:a="http://schemas.openxmlformats.org/drawingml/2006/main">
+              <a:graphicData uri="http://schemas.openxmlformats.org/drawingml/2006/picture">
+                <pic:pic xmlns:pic="http://schemas.openxmlformats.org/drawingml/2006/picture">
+                  <pic:nvPicPr>
+                    <pic:cNvPr id="607023145" name=""/>
+                    <pic:cNvPicPr/>
+                  </pic:nvPicPr>
+                  <pic:blipFill>
+                    <a:blip r:embed="rId13"/>
+                    <a:stretch>
+                      <a:fillRect/>
+                    </a:stretch>
+                  </pic:blipFill>
+                  <pic:spPr>
+                    <a:xfrm>
+                      <a:off x="0" y="0"/>
+                      <a:ext cx="5730737" cy="5235394"/>
+                    </a:xfrm>
+                    <a:prstGeom prst="rect">
+                      <a:avLst/>
+                    </a:prstGeom>
+                  </pic:spPr>
+                </pic:pic>
+              </a:graphicData>
+            </a:graphic>
+          </wp:inline>
+        </w:drawing>
+      </w:r>
+      <w:r>
+        <w:rPr>
+          <w:rFonts w:ascii="Times New Roman" w:hAnsi="Times New Roman" w:cs="Times New Roman"/>
+          <w:b/>
+          <w:bCs/>
+          <w:sz w:val="24"/>
+          <w:szCs w:val="24"/>
+        </w:rPr>
+        <w:t xml:space="preserve"> </w:t>
+      </w:r>
+      <w:r>
+        <w:rPr>
+          <w:rFonts w:ascii="Times New Roman" w:hAnsi="Times New Roman" w:cs="Times New Roman"/>
+          <w:b/>
+          <w:bCs/>
+          <w:sz w:val="24"/>
+          <w:szCs w:val="24"/>
+        </w:rPr>
+        <w:t xml:space="preserve"> </w:t>
+      </w:r>
+    </w:p>
+    <w:p>
+      <w:pPr>
+        <w:rPr>
+          <w:rFonts w:ascii="Times New Roman" w:hAnsi="Times New Roman" w:cs="Times New Roman"/>
+          <w:b/>
+          <w:bCs/>
+          <w:sz w:val="24"/>
+          <w:szCs w:val="24"/>
+        </w:rPr>
+      </w:pPr>
+    </w:p>
+    <w:p>
+      <w:pPr>
+        <w:rPr>
+          <w:rFonts w:ascii="Times New Roman" w:hAnsi="Times New Roman" w:cs="Times New Roman"/>
+          <w:b/>
+          <w:bCs/>
+          <w:sz w:val="24"/>
+          <w:szCs w:val="24"/>
+        </w:rPr>
+      </w:pPr>
+      <w:r>
+        <w:rPr>
+          <w:rFonts w:ascii="Times New Roman" w:hAnsi="Times New Roman" w:cs="Times New Roman"/>
+          <w:b/>
+          <w:bCs/>
+          <w:sz w:val="24"/>
+          <w:szCs w:val="24"/>
+        </w:rPr>
+        <w:lastRenderedPageBreak/>
+        <w:drawing>
+          <wp:inline distT="0" distB="0" distL="0" distR="0" wp14:anchorId="7755FB60" wp14:editId="38997DEC">
+            <wp:extent cx="4892464" cy="1676545"/>
+            <wp:effectExtent l="0" t="0" r="3810" b="0"/>
+            <wp:docPr id="336551452" name="Picture 1"/>
+            <wp:cNvGraphicFramePr>
+              <a:graphicFrameLocks xmlns:a="http://schemas.openxmlformats.org/drawingml/2006/main" noChangeAspect="1"/>
+            </wp:cNvGraphicFramePr>
+            <a:graphic xmlns:a="http://schemas.openxmlformats.org/drawingml/2006/main">
+              <a:graphicData uri="http://schemas.openxmlformats.org/drawingml/2006/picture">
+                <pic:pic xmlns:pic="http://schemas.openxmlformats.org/drawingml/2006/picture">
+                  <pic:nvPicPr>
+                    <pic:cNvPr id="336551452" name=""/>
+                    <pic:cNvPicPr/>
+                  </pic:nvPicPr>
+                  <pic:blipFill>
+                    <a:blip r:embed="rId14"/>
+                    <a:stretch>
+                      <a:fillRect/>
+                    </a:stretch>
+                  </pic:blipFill>
+                  <pic:spPr>
+                    <a:xfrm>
+                      <a:off x="0" y="0"/>
+                      <a:ext cx="4892464" cy="1676545"/>
+                    </a:xfrm>
+                    <a:prstGeom prst="rect">
+                      <a:avLst/>
+                    </a:prstGeom>
+                  </pic:spPr>
+                </pic:pic>
+              </a:graphicData>
+            </a:graphic>
+          </wp:inline>
+        </w:drawing>
+      </w:r>
+      <w:r>
+        <w:rPr>
+          <w:rFonts w:ascii="Times New Roman" w:hAnsi="Times New Roman" w:cs="Times New Roman"/>
+          <w:b/>
+          <w:bCs/>
+          <w:sz w:val="24"/>
+          <w:szCs w:val="24"/>
+        </w:rPr>
+        <w:t xml:space="preserve"> </w:t>
+      </w:r>
+    </w:p>
+    <w:p>
+      <w:pPr>
+        <w:rPr>
+          <w:rFonts w:ascii="Times New Roman" w:hAnsi="Times New Roman" w:cs="Times New Roman"/>
+          <w:b/>
+          <w:bCs/>
+          <w:sz w:val="24"/>
+          <w:szCs w:val="24"/>
+        </w:rPr>
+      </w:pPr>
+      <w:r>
+        <w:rPr>
+          <w:rFonts w:ascii="Times New Roman" w:hAnsi="Times New Roman" w:cs="Times New Roman"/>
+          <w:b/>
+          <w:bCs/>
+          <w:sz w:val="24"/>
+          <w:szCs w:val="24"/>
+        </w:rPr>
+        <w:drawing>
+          <wp:inline distT="0" distB="0" distL="0" distR="0" wp14:anchorId="23B8EB21" wp14:editId="3460067A">
+            <wp:extent cx="5734050" cy="2331720"/>
+            <wp:effectExtent l="0" t="0" r="0" b="0"/>
+            <wp:docPr id="2126966173" name="Picture 1"/>
+            <wp:cNvGraphicFramePr>
+              <a:graphicFrameLocks xmlns:a="http://schemas.openxmlformats.org/drawingml/2006/main" noChangeAspect="1"/>
+            </wp:cNvGraphicFramePr>
+            <a:graphic xmlns:a="http://schemas.openxmlformats.org/drawingml/2006/main">
+              <a:graphicData uri="http://schemas.openxmlformats.org/drawingml/2006/picture">
+                <pic:pic xmlns:pic="http://schemas.openxmlformats.org/drawingml/2006/picture">
+                  <pic:nvPicPr>
+                    <pic:cNvPr id="2126966173" name=""/>
+                    <pic:cNvPicPr/>
+                  </pic:nvPicPr>
+                  <pic:blipFill>
+                    <a:blip r:embed="rId15"/>
+                    <a:stretch>
+                      <a:fillRect/>
+                    </a:stretch>
+                  </pic:blipFill>
+                  <pic:spPr>
+                    <a:xfrm>
+                      <a:off x="0" y="0"/>
+                      <a:ext cx="5734050" cy="2331720"/>
+                    </a:xfrm>
+                    <a:prstGeom prst="rect">
+                      <a:avLst/>
+                    </a:prstGeom>
+                  </pic:spPr>
+                </pic:pic>
+              </a:graphicData>
+            </a:graphic>
+          </wp:inline>
+        </w:drawing>
+      </w:r>
+    </w:p>
+    <w:p>
+      <w:pPr>
+        <w:rPr>
+          <w:rFonts w:ascii="Times New Roman" w:hAnsi="Times New Roman" w:cs="Times New Roman"/>
+          <w:b/>
+          <w:bCs/>
+          <w:sz w:val="24"/>
+          <w:szCs w:val="24"/>
+        </w:rPr>
+      </w:pPr>
+      <w:r>
+        <w:rPr>
+          <w:rFonts w:ascii="Times New Roman" w:hAnsi="Times New Roman" w:cs="Times New Roman"/>
+          <w:b/>
+          <w:bCs/>
+          <w:sz w:val="24"/>
+          <w:szCs w:val="24"/>
+        </w:rPr>
+        <w:drawing>
+          <wp:inline distT="0" distB="0" distL="0" distR="0" wp14:anchorId="444DD557" wp14:editId="5746BFC1">
+            <wp:extent cx="5734050" cy="2270125"/>
+            <wp:effectExtent l="0" t="0" r="0" b="0"/>
+            <wp:docPr id="2026330475" name="Picture 1"/>
+            <wp:cNvGraphicFramePr>
+              <a:graphicFrameLocks xmlns:a="http://schemas.openxmlformats.org/drawingml/2006/main" noChangeAspect="1"/>
+            </wp:cNvGraphicFramePr>
+            <a:graphic xmlns:a="http://schemas.openxmlformats.org/drawingml/2006/main">
+              <a:graphicData uri="http://schemas.openxmlformats.org/drawingml/2006/picture">
+                <pic:pic xmlns:pic="http://schemas.openxmlformats.org/drawingml/2006/picture">
+                  <pic:nvPicPr>
+                    <pic:cNvPr id="2026330475" name=""/>
+                    <pic:cNvPicPr/>
+                  </pic:nvPicPr>
+                  <pic:blipFill>
+                    <a:blip r:embed="rId16"/>
+                    <a:stretch>
+                      <a:fillRect/>
+                    </a:stretch>
+                  </pic:blipFill>
+                  <pic:spPr>
+                    <a:xfrm>
+                      <a:off x="0" y="0"/>
+                      <a:ext cx="5734050" cy="2270125"/>
+                    </a:xfrm>
+                    <a:prstGeom prst="rect">
+                      <a:avLst/>
+                    </a:prstGeom>
+                  </pic:spPr>
+                </pic:pic>
+              </a:graphicData>
+            </a:graphic>
+          </wp:inline>
+        </w:drawing>
+      </w:r>
+    </w:p>
+    <w:p>
+      <w:pPr>
+        <w:rPr>
+          <w:rFonts w:ascii="Times New Roman" w:hAnsi="Times New Roman" w:cs="Times New Roman"/>
+          <w:b/>
+          <w:bCs/>
+          <w:sz w:val="24"/>
+          <w:szCs w:val="24"/>
+        </w:rPr>
+      </w:pPr>
+    </w:p>
+    <w:p>
+      <w:pPr>
+        <w:rPr>
+          <w:rFonts w:ascii="Times New Roman" w:hAnsi="Times New Roman" w:cs="Times New Roman"/>
+          <w:sz w:val="24"/>
+          <w:szCs w:val="24"/>
+        </w:rPr>
+      </w:pPr>
+      <w:r>
+        <w:rPr>
+          <w:rFonts w:ascii="Times New Roman" w:hAnsi="Times New Roman" w:cs="Times New Roman"/>
+          <w:b/>
+          <w:bCs/>
+          <w:sz w:val="24"/>
+          <w:szCs w:val="24"/>
+        </w:rPr>
+        <w:t>[1</w:t>
+      </w:r>
+      <w:r>
+        <w:rPr>
+          <w:rFonts w:ascii="Times New Roman" w:hAnsi="Times New Roman" w:cs="Times New Roman"/>
+          <w:b/>
+          <w:bCs/>
+          <w:sz w:val="24"/>
+          <w:szCs w:val="24"/>
+        </w:rPr>
+        <w:t>2</w:t>
+      </w:r>
+      <w:r>
+        <w:rPr>
+          <w:rFonts w:ascii="Times New Roman" w:hAnsi="Times New Roman" w:cs="Times New Roman"/>
+          <w:b/>
+          <w:bCs/>
+          <w:sz w:val="24"/>
+          <w:szCs w:val="24"/>
+        </w:rPr>
+        <w:t xml:space="preserve">] </w:t>
+      </w:r>
+      <w:r>
+        <w:rPr>
+          <w:rFonts w:ascii="Times New Roman" w:hAnsi="Times New Roman" w:cs="Times New Roman"/>
+          <w:b/>
+          <w:bCs/>
+          <w:sz w:val="24"/>
+          <w:szCs w:val="24"/>
+        </w:rPr>
         <w:t>SUMMARY:</w:t>
       </w:r>
     </w:p>
@@ -7923,25 +8241,16 @@
           <w:sz w:val="24"/>
           <w:szCs w:val="24"/>
         </w:rPr>
-        <w:t xml:space="preserve">The proposed project, “Coordinated Multi-Channel False Data Injection Attack Detection Using Physiology-Aware Cross-Sensor Consistency </w:t>
-      </w:r>
-      <w:proofErr w:type="spellStart"/>
-      <w:r>
-        <w:rPr>
-          <w:rFonts w:ascii="Times New Roman" w:hAnsi="Times New Roman" w:cs="Times New Roman"/>
-          <w:sz w:val="24"/>
-          <w:szCs w:val="24"/>
-        </w:rPr>
-        <w:t>Modeling</w:t>
-      </w:r>
-      <w:proofErr w:type="spellEnd"/>
-      <w:r>
-        <w:rPr>
-          <w:rFonts w:ascii="Times New Roman" w:hAnsi="Times New Roman" w:cs="Times New Roman"/>
-          <w:sz w:val="24"/>
-          <w:szCs w:val="24"/>
-        </w:rPr>
-        <w:t xml:space="preserve"> in IoMT,” focuses on improving the security and reliability of physiological data transmitted by Internet of Medical Things (IoMT) devices. Medical monitoring systems continuously collect vital signs such as heart rate, oxygen saturation, blood pressure, respiratory rate, and temperature, making these systems potential targets for False Data Injection (FDI) attacks. Existing detection approaches often evaluate individual sensor channels independently or focus mainly on network-level intrusions. This creates a potential vulnerability where an attacker can simultaneously manipulate multiple correlated physiological signals while keeping each individual value within a medically plausible range. Although the manipulated values may appear normal separately, their combined pattern may violate expected physiological relationships. The project therefore aims to formally model this coordinated multi-channel FDI threat and experimentally evaluate the vulnerability of existing detection approaches using real physiological datasets.</w:t>
+        <w:t xml:space="preserve">The proposed project, “Coordinated Multi-Channel False Data Injection Attack Detection Using Physiology-Aware Cross-Sensor Consistency Modeling in IoMT,” focuses on improving the security and reliability of physiological data transmitted by Internet of Medical Things (IoMT) devices. Medical monitoring systems continuously collect vital signs such as heart rate, oxygen saturation, blood pressure, respiratory rate, and temperature, making these systems potential targets for False Data Injection (FDI) attacks. Existing detection approaches often evaluate individual sensor channels independently or focus mainly on network-level intrusions. This creates a potential vulnerability where an attacker can simultaneously manipulate multiple </w:t>
+      </w:r>
+      <w:r>
+        <w:rPr>
+          <w:rFonts w:ascii="Times New Roman" w:hAnsi="Times New Roman" w:cs="Times New Roman"/>
+          <w:sz w:val="24"/>
+          <w:szCs w:val="24"/>
+        </w:rPr>
+        <w:lastRenderedPageBreak/>
+        <w:t>correlated physiological signals while keeping each individual value within a medically plausible range. Although the manipulated values may appear normal separately, their combined pattern may violate expected physiological relationships. The project therefore aims to formally model this coordinated multi-channel FDI threat and experimentally evaluate the vulnerability of existing detection approaches using real physiological datasets.</w:t>
       </w:r>
     </w:p>
     <w:p>
@@ -7959,52 +8268,7 @@
           <w:sz w:val="24"/>
           <w:szCs w:val="24"/>
         </w:rPr>
-        <w:t xml:space="preserve">To address this limitation, the project proposes a Cross-Sensor Consistency </w:t>
-      </w:r>
-      <w:proofErr w:type="spellStart"/>
-      <w:r>
-        <w:rPr>
-          <w:rFonts w:ascii="Times New Roman" w:hAnsi="Times New Roman" w:cs="Times New Roman"/>
-          <w:sz w:val="24"/>
-          <w:szCs w:val="24"/>
-        </w:rPr>
-        <w:t>Modeling</w:t>
-      </w:r>
-      <w:proofErr w:type="spellEnd"/>
-      <w:r>
-        <w:rPr>
-          <w:rFonts w:ascii="Times New Roman" w:hAnsi="Times New Roman" w:cs="Times New Roman"/>
-          <w:sz w:val="24"/>
-          <w:szCs w:val="24"/>
-        </w:rPr>
-        <w:t xml:space="preserve"> (CSCM) framework that jointly </w:t>
-      </w:r>
-      <w:proofErr w:type="spellStart"/>
-      <w:r>
-        <w:rPr>
-          <w:rFonts w:ascii="Times New Roman" w:hAnsi="Times New Roman" w:cs="Times New Roman"/>
-          <w:sz w:val="24"/>
-          <w:szCs w:val="24"/>
-        </w:rPr>
-        <w:t>analyzes</w:t>
-      </w:r>
-      <w:proofErr w:type="spellEnd"/>
-      <w:r>
-        <w:rPr>
-          <w:rFonts w:ascii="Times New Roman" w:hAnsi="Times New Roman" w:cs="Times New Roman"/>
-          <w:sz w:val="24"/>
-          <w:szCs w:val="24"/>
-        </w:rPr>
-        <w:t xml:space="preserve"> relationships among multiple physiological channels. The system will preprocess public physiological datasets such as PhysioNet/CinC-2012, WESAD, and MIMIC-III Waveform where accessible, generate controlled coordinated FDI attacks, and compare the proposed approach with appropriate baseline detection methods. A physiology-informed graph attention network will represent relationships between vital-sign channels and </w:t>
-      </w:r>
-      <w:r>
-        <w:rPr>
-          <w:rFonts w:ascii="Times New Roman" w:hAnsi="Times New Roman" w:cs="Times New Roman"/>
-          <w:sz w:val="24"/>
-          <w:szCs w:val="24"/>
-        </w:rPr>
-        <w:lastRenderedPageBreak/>
-        <w:t>learn patterns of cross-sensor consistency for attack detection. The proposed system will be evaluated using metrics such as sensitivity, specificity, precision, F1-score, false-positive rate, and AUROC, together with statistical significance testing, ablation studies, and attention-based interpretability analysis. The expected outcome is a reproducible detection framework capable of identifying coordinated attacks that may evade independent sensor-level validation while maintaining performance against conventional attacks. The project aims to contribute a coordinated multi-channel attack model, a physiology-aware cross-sensor detection framework, and a comprehensive experimental evaluation for improving the security and reliability of IoMT physiological monitoring systems.</w:t>
+        <w:t>To address this limitation, the project proposes a Cross-Sensor Consistency Modeling (CSCM) framework that jointly analyzes relationships among multiple physiological channels. The system will preprocess public physiological datasets such as PhysioNet/CinC-2012, WESAD, and MIMIC-III Waveform where accessible, generate controlled coordinated FDI attacks, and compare the proposed approach with appropriate baseline detection methods. A physiology-informed graph attention network will represent relationships between vital-sign channels and learn patterns of cross-sensor consistency for attack detection. The proposed system will be evaluated using metrics such as sensitivity, specificity, precision, F1-score, false-positive rate, and AUROC, together with statistical significance testing, ablation studies, and attention-based interpretability analysis. The expected outcome is a reproducible detection framework capable of identifying coordinated attacks that may evade independent sensor-level validation while maintaining performance against conventional attacks. The project aims to contribute a coordinated multi-channel attack model, a physiology-aware cross-sensor detection framework, and a comprehensive experimental evaluation for improving the security and reliability of IoMT physiological monitoring systems.</w:t>
       </w:r>
     </w:p>
     <w:p>
@@ -8091,25 +8355,7 @@
           <w:sz w:val="24"/>
           <w:szCs w:val="24"/>
         </w:rPr>
-        <w:t xml:space="preserve">Padhan, S., &amp; </w:t>
-      </w:r>
-      <w:proofErr w:type="spellStart"/>
-      <w:r>
-        <w:rPr>
-          <w:rFonts w:ascii="Times New Roman" w:hAnsi="Times New Roman" w:cs="Times New Roman"/>
-          <w:sz w:val="24"/>
-          <w:szCs w:val="24"/>
-        </w:rPr>
-        <w:t>Turuk</w:t>
-      </w:r>
-      <w:proofErr w:type="spellEnd"/>
-      <w:r>
-        <w:rPr>
-          <w:rFonts w:ascii="Times New Roman" w:hAnsi="Times New Roman" w:cs="Times New Roman"/>
-          <w:sz w:val="24"/>
-          <w:szCs w:val="24"/>
-        </w:rPr>
-        <w:t xml:space="preserve">, A. K. (2025). A technique to detect and mitigate false data injection attacks in cyber-physical systems. </w:t>
+        <w:t xml:space="preserve">Padhan, S., &amp; Turuk, A. K. (2025). A technique to detect and mitigate false data injection attacks in cyber-physical systems. </w:t>
       </w:r>
       <w:r>
         <w:rPr>
@@ -8361,6 +8607,7 @@
           <w:sz w:val="24"/>
           <w:szCs w:val="24"/>
         </w:rPr>
+        <w:lastRenderedPageBreak/>
         <w:t xml:space="preserve">Liu, Z., Huang, X., Zhang, J., Hao, Z., Sun, L., &amp; Peng, H. (2024). Multivariate time-series anomaly detection based on enhancing graph attention networks with topological analysis. In </w:t>
       </w:r>
       <w:r>
@@ -8445,25 +8692,7 @@
           <w:sz w:val="24"/>
           <w:szCs w:val="24"/>
         </w:rPr>
-        <w:t xml:space="preserve">Audibert, J., </w:t>
-      </w:r>
-      <w:proofErr w:type="spellStart"/>
-      <w:r>
-        <w:rPr>
-          <w:rFonts w:ascii="Times New Roman" w:hAnsi="Times New Roman" w:cs="Times New Roman"/>
-          <w:sz w:val="24"/>
-          <w:szCs w:val="24"/>
-        </w:rPr>
-        <w:t>Michiardi</w:t>
-      </w:r>
-      <w:proofErr w:type="spellEnd"/>
-      <w:r>
-        <w:rPr>
-          <w:rFonts w:ascii="Times New Roman" w:hAnsi="Times New Roman" w:cs="Times New Roman"/>
-          <w:sz w:val="24"/>
-          <w:szCs w:val="24"/>
-        </w:rPr>
-        <w:t xml:space="preserve">, P., Guyard, F., Marti, S., &amp; Zuluaga, M. A. (2020). USAD: Unsupervised anomaly detection on multivariate time series. In </w:t>
+        <w:t xml:space="preserve">Audibert, J., Michiardi, P., Guyard, F., Marti, S., &amp; Zuluaga, M. A. (2020). USAD: Unsupervised anomaly detection on multivariate time series. In </w:t>
       </w:r>
       <w:r>
         <w:rPr>
@@ -8473,18 +8702,7 @@
           <w:sz w:val="24"/>
           <w:szCs w:val="24"/>
         </w:rPr>
-        <w:t xml:space="preserve">Proceedings of the </w:t>
-      </w:r>
-      <w:r>
-        <w:rPr>
-          <w:rFonts w:ascii="Times New Roman" w:hAnsi="Times New Roman" w:cs="Times New Roman"/>
-          <w:i/>
-          <w:iCs/>
-          <w:sz w:val="24"/>
-          <w:szCs w:val="24"/>
-        </w:rPr>
-        <w:lastRenderedPageBreak/>
-        <w:t>26th ACM SIGKDD International Conference on Knowledge Discovery &amp; Data Mining</w:t>
+        <w:t>Proceedings of the 26th ACM SIGKDD International Conference on Knowledge Discovery &amp; Data Mining</w:t>
       </w:r>
       <w:r>
         <w:rPr>
@@ -8566,25 +8784,7 @@
           <w:sz w:val="24"/>
           <w:szCs w:val="24"/>
         </w:rPr>
-        <w:t xml:space="preserve">Tuli, S., Casale, G., &amp; Jennings, N. R. (2022). </w:t>
-      </w:r>
-      <w:proofErr w:type="spellStart"/>
-      <w:r>
-        <w:rPr>
-          <w:rFonts w:ascii="Times New Roman" w:hAnsi="Times New Roman" w:cs="Times New Roman"/>
-          <w:sz w:val="24"/>
-          <w:szCs w:val="24"/>
-        </w:rPr>
-        <w:t>TranAD</w:t>
-      </w:r>
-      <w:proofErr w:type="spellEnd"/>
-      <w:r>
-        <w:rPr>
-          <w:rFonts w:ascii="Times New Roman" w:hAnsi="Times New Roman" w:cs="Times New Roman"/>
-          <w:sz w:val="24"/>
-          <w:szCs w:val="24"/>
-        </w:rPr>
-        <w:t xml:space="preserve">: Deep transformer networks for anomaly detection in multivariate time series data. </w:t>
+        <w:t xml:space="preserve">Tuli, S., Casale, G., &amp; Jennings, N. R. (2022). TranAD: Deep transformer networks for anomaly detection in multivariate time series data. </w:t>
       </w:r>
       <w:r>
         <w:rPr>
@@ -8670,41 +8870,13 @@
           <w:szCs w:val="24"/>
         </w:rPr>
       </w:pPr>
-      <w:proofErr w:type="spellStart"/>
-      <w:r>
-        <w:rPr>
-          <w:rFonts w:ascii="Times New Roman" w:hAnsi="Times New Roman" w:cs="Times New Roman"/>
-          <w:sz w:val="24"/>
-          <w:szCs w:val="24"/>
-        </w:rPr>
-        <w:t>Kalakoti</w:t>
-      </w:r>
-      <w:proofErr w:type="spellEnd"/>
-      <w:r>
-        <w:rPr>
-          <w:rFonts w:ascii="Times New Roman" w:hAnsi="Times New Roman" w:cs="Times New Roman"/>
-          <w:sz w:val="24"/>
-          <w:szCs w:val="24"/>
-        </w:rPr>
-        <w:t xml:space="preserve">, R., Nõmm, S., &amp; </w:t>
-      </w:r>
-      <w:proofErr w:type="spellStart"/>
-      <w:r>
-        <w:rPr>
-          <w:rFonts w:ascii="Times New Roman" w:hAnsi="Times New Roman" w:cs="Times New Roman"/>
-          <w:sz w:val="24"/>
-          <w:szCs w:val="24"/>
-        </w:rPr>
-        <w:t>Bahsi</w:t>
-      </w:r>
-      <w:proofErr w:type="spellEnd"/>
-      <w:r>
-        <w:rPr>
-          <w:rFonts w:ascii="Times New Roman" w:hAnsi="Times New Roman" w:cs="Times New Roman"/>
-          <w:sz w:val="24"/>
-          <w:szCs w:val="24"/>
-        </w:rPr>
-        <w:t xml:space="preserve">, H. (2024). Explainable transformer-based intrusion detection in Internet of Medical Things (IoMT) networks. In </w:t>
+      <w:r>
+        <w:rPr>
+          <w:rFonts w:ascii="Times New Roman" w:hAnsi="Times New Roman" w:cs="Times New Roman"/>
+          <w:sz w:val="24"/>
+          <w:szCs w:val="24"/>
+        </w:rPr>
+        <w:t xml:space="preserve">Kalakoti, R., Nõmm, S., &amp; Bahsi, H. (2024). Explainable transformer-based intrusion detection in Internet of Medical Things (IoMT) networks. In </w:t>
       </w:r>
       <w:r>
         <w:rPr>
@@ -8744,43 +8916,7 @@
           <w:sz w:val="24"/>
           <w:szCs w:val="24"/>
         </w:rPr>
-        <w:t xml:space="preserve">Ioannou, I., </w:t>
-      </w:r>
-      <w:proofErr w:type="spellStart"/>
-      <w:r>
-        <w:rPr>
-          <w:rFonts w:ascii="Times New Roman" w:hAnsi="Times New Roman" w:cs="Times New Roman"/>
-          <w:sz w:val="24"/>
-          <w:szCs w:val="24"/>
-        </w:rPr>
-        <w:t>Nagaradjane</w:t>
-      </w:r>
-      <w:proofErr w:type="spellEnd"/>
-      <w:r>
-        <w:rPr>
-          <w:rFonts w:ascii="Times New Roman" w:hAnsi="Times New Roman" w:cs="Times New Roman"/>
-          <w:sz w:val="24"/>
-          <w:szCs w:val="24"/>
-        </w:rPr>
-        <w:t xml:space="preserve">, P., </w:t>
-      </w:r>
-      <w:proofErr w:type="spellStart"/>
-      <w:r>
-        <w:rPr>
-          <w:rFonts w:ascii="Times New Roman" w:hAnsi="Times New Roman" w:cs="Times New Roman"/>
-          <w:sz w:val="24"/>
-          <w:szCs w:val="24"/>
-        </w:rPr>
-        <w:t>Angin</w:t>
-      </w:r>
-      <w:proofErr w:type="spellEnd"/>
-      <w:r>
-        <w:rPr>
-          <w:rFonts w:ascii="Times New Roman" w:hAnsi="Times New Roman" w:cs="Times New Roman"/>
-          <w:sz w:val="24"/>
-          <w:szCs w:val="24"/>
-        </w:rPr>
-        <w:t xml:space="preserve">, P., Balasubramanian, P., Kavitha, K. J., Murugan, P., &amp; Vassiliou, V. (2024). GEMLIDS-MIOT: A green effective machine learning intrusion detection system based on federated learning for medical IoT network security hardening. </w:t>
+        <w:t xml:space="preserve">Ioannou, I., Nagaradjane, P., Angin, P., Balasubramanian, P., Kavitha, K. J., Murugan, P., &amp; Vassiliou, V. (2024). GEMLIDS-MIOT: A green effective machine learning intrusion detection system based on federated learning for medical IoT network security hardening. </w:t>
       </w:r>
       <w:r>
         <w:rPr>
@@ -8828,25 +8964,7 @@
           <w:sz w:val="24"/>
           <w:szCs w:val="24"/>
         </w:rPr>
-        <w:t>Hosain, Y., &amp; Çakmak, M. (2025). XAI-</w:t>
-      </w:r>
-      <w:proofErr w:type="spellStart"/>
-      <w:r>
-        <w:rPr>
-          <w:rFonts w:ascii="Times New Roman" w:hAnsi="Times New Roman" w:cs="Times New Roman"/>
-          <w:sz w:val="24"/>
-          <w:szCs w:val="24"/>
-        </w:rPr>
-        <w:t>XGBoost</w:t>
-      </w:r>
-      <w:proofErr w:type="spellEnd"/>
-      <w:r>
-        <w:rPr>
-          <w:rFonts w:ascii="Times New Roman" w:hAnsi="Times New Roman" w:cs="Times New Roman"/>
-          <w:sz w:val="24"/>
-          <w:szCs w:val="24"/>
-        </w:rPr>
-        <w:t xml:space="preserve">: An innovative explainable intrusion detection approach for securing Internet of Medical Things systems. </w:t>
+        <w:t xml:space="preserve">Hosain, Y., &amp; Çakmak, M. (2025). XAI-XGBoost: An innovative explainable intrusion detection approach for securing Internet of Medical Things systems. </w:t>
       </w:r>
       <w:r>
         <w:rPr>
@@ -8886,25 +9004,7 @@
           <w:sz w:val="24"/>
           <w:szCs w:val="24"/>
         </w:rPr>
-        <w:t xml:space="preserve">Khan, M. Z., Sabur, A., &amp; </w:t>
-      </w:r>
-      <w:proofErr w:type="spellStart"/>
-      <w:r>
-        <w:rPr>
-          <w:rFonts w:ascii="Times New Roman" w:hAnsi="Times New Roman" w:cs="Times New Roman"/>
-          <w:sz w:val="24"/>
-          <w:szCs w:val="24"/>
-        </w:rPr>
-        <w:t>Ghandorh</w:t>
-      </w:r>
-      <w:proofErr w:type="spellEnd"/>
-      <w:r>
-        <w:rPr>
-          <w:rFonts w:ascii="Times New Roman" w:hAnsi="Times New Roman" w:cs="Times New Roman"/>
-          <w:sz w:val="24"/>
-          <w:szCs w:val="24"/>
-        </w:rPr>
-        <w:t xml:space="preserve">, H. (2025). A novel Internet of Medical Things hybrid model for cybersecurity anomaly detection. </w:t>
+        <w:t xml:space="preserve">Khan, M. Z., Sabur, A., &amp; Ghandorh, H. (2025). A novel Internet of Medical Things hybrid model for cybersecurity anomaly detection. </w:t>
       </w:r>
       <w:r>
         <w:rPr>
@@ -8938,41 +9038,13 @@
           <w:szCs w:val="24"/>
         </w:rPr>
       </w:pPr>
-      <w:proofErr w:type="spellStart"/>
-      <w:r>
-        <w:rPr>
-          <w:rFonts w:ascii="Times New Roman" w:hAnsi="Times New Roman" w:cs="Times New Roman"/>
-          <w:sz w:val="24"/>
-          <w:szCs w:val="24"/>
-        </w:rPr>
-        <w:t>Adohinzin</w:t>
-      </w:r>
-      <w:proofErr w:type="spellEnd"/>
-      <w:r>
-        <w:rPr>
-          <w:rFonts w:ascii="Times New Roman" w:hAnsi="Times New Roman" w:cs="Times New Roman"/>
-          <w:sz w:val="24"/>
-          <w:szCs w:val="24"/>
-        </w:rPr>
-        <w:t xml:space="preserve">, O., &amp; </w:t>
-      </w:r>
-      <w:proofErr w:type="spellStart"/>
-      <w:r>
-        <w:rPr>
-          <w:rFonts w:ascii="Times New Roman" w:hAnsi="Times New Roman" w:cs="Times New Roman"/>
-          <w:sz w:val="24"/>
-          <w:szCs w:val="24"/>
-        </w:rPr>
-        <w:t>Harrath</w:t>
-      </w:r>
-      <w:proofErr w:type="spellEnd"/>
-      <w:r>
-        <w:rPr>
-          <w:rFonts w:ascii="Times New Roman" w:hAnsi="Times New Roman" w:cs="Times New Roman"/>
-          <w:sz w:val="24"/>
-          <w:szCs w:val="24"/>
-        </w:rPr>
-        <w:t xml:space="preserve">, Y. (2026). A systematic review of intrusion detection systems for Internet of Medical Things: Performance, efficiency, explainability, and generalization. </w:t>
+      <w:r>
+        <w:rPr>
+          <w:rFonts w:ascii="Times New Roman" w:hAnsi="Times New Roman" w:cs="Times New Roman"/>
+          <w:sz w:val="24"/>
+          <w:szCs w:val="24"/>
+        </w:rPr>
+        <w:t xml:space="preserve">Adohinzin, O., &amp; Harrath, Y. (2026). A systematic review of intrusion detection systems for Internet of Medical Things: Performance, efficiency, explainability, and generalization. </w:t>
       </w:r>
       <w:r>
         <w:rPr>
@@ -9052,25 +9124,7 @@
           <w:sz w:val="24"/>
           <w:szCs w:val="24"/>
         </w:rPr>
-        <w:t xml:space="preserve">Schmidt, P., Reiss, A., </w:t>
-      </w:r>
-      <w:proofErr w:type="spellStart"/>
-      <w:r>
-        <w:rPr>
-          <w:rFonts w:ascii="Times New Roman" w:hAnsi="Times New Roman" w:cs="Times New Roman"/>
-          <w:sz w:val="24"/>
-          <w:szCs w:val="24"/>
-        </w:rPr>
-        <w:t>Dürichen</w:t>
-      </w:r>
-      <w:proofErr w:type="spellEnd"/>
-      <w:r>
-        <w:rPr>
-          <w:rFonts w:ascii="Times New Roman" w:hAnsi="Times New Roman" w:cs="Times New Roman"/>
-          <w:sz w:val="24"/>
-          <w:szCs w:val="24"/>
-        </w:rPr>
-        <w:t xml:space="preserve">, R., Marberger, C., &amp; Van Laerhoven, K. (2018). Introducing WESAD, a multimodal dataset for wearable stress and affect detection. In </w:t>
+        <w:t xml:space="preserve">Schmidt, P., Reiss, A., Dürichen, R., Marberger, C., &amp; Van Laerhoven, K. (2018). Introducing WESAD, a multimodal dataset for wearable stress and affect detection. In </w:t>
       </w:r>
       <w:r>
         <w:rPr>
@@ -9090,7 +9144,7 @@
       </w:r>
     </w:p>
     <w:sectPr>
-      <w:footerReference w:type="default" r:id="rId12"/>
+      <w:footerReference w:type="default" r:id="rId17"/>
       <w:pgSz w:w="11910" w:h="16840"/>
       <w:pgMar w:top="1440" w:right="1440" w:bottom="1440" w:left="1440" w:header="708" w:footer="708" w:gutter="0"/>
       <w:pgBorders w:offsetFrom="page">
@@ -9107,7 +9161,7 @@
 </file>
 
 <file path=word/endnotes.xml><?xml version="1.0" encoding="utf-8"?>
-<w:endnotes xmlns:wpc="http://schemas.microsoft.com/office/word/2010/wordprocessingCanvas" xmlns:cx="http://schemas.microsoft.com/office/drawing/2014/chartex" xmlns:cx1="http://schemas.microsoft.com/office/drawing/2015/9/8/chartex" xmlns:cx2="http://schemas.microsoft.com/office/drawing/2015/10/21/chartex" xmlns:cx3="http://schemas.microsoft.com/office/drawing/2016/5/9/chartex" xmlns:cx4="http://schemas.microsoft.com/office/drawing/2016/5/10/chartex" xmlns:cx5="http://schemas.microsoft.com/office/drawing/2016/5/11/chartex" xmlns:cx6="http://schemas.microsoft.com/office/drawing/2016/5/12/chartex" xmlns:cx7="http://schemas.microsoft.com/office/drawing/2016/5/13/chartex" xmlns:cx8="http://schemas.microsoft.com/office/drawing/2016/5/14/chartex" xmlns:mc="http://schemas.openxmlformats.org/markup-compatibility/2006" xmlns:aink="http://schemas.microsoft.com/office/drawing/2016/ink" xmlns:am3d="http://schemas.microsoft.com/office/drawing/2017/model3d" xmlns:o="urn:schemas-microsoft-com:office:office" xmlns:oel="http://schemas.microsoft.com/office/2019/extlst" xmlns:r="http://schemas.openxmlformats.org/officeDocument/2006/relationships" xmlns:m="http://schemas.openxmlformats.org/officeDocument/2006/math" xmlns:v="urn:schemas-microsoft-com:vml" xmlns:wp14="http://schemas.microsoft.com/office/word/2010/wordprocessingDrawing" xmlns:wp="http://schemas.openxmlformats.org/drawingml/2006/wordprocessingDrawing" xmlns:w10="urn:schemas-microsoft-com:office:word" xmlns:w="http://schemas.openxmlformats.org/wordprocessingml/2006/main" xmlns:w14="http://schemas.microsoft.com/office/word/2010/wordml" xmlns:w15="http://schemas.microsoft.com/office/word/2012/wordml" xmlns:w16cei="http://schemas.microsoft.com/office/word/2026/wordml/cei" xmlns:w16cex="http://schemas.microsoft.com/office/word/2018/wordml/cex" xmlns:w16cid="http://schemas.microsoft.com/office/word/2016/wordml/cid" xmlns:w16="http://schemas.microsoft.com/office/word/2018/wordml" xmlns:w16du="http://schemas.microsoft.com/office/word/2023/wordml/word16du" xmlns:w16sdtdh="http://schemas.microsoft.com/office/word/2020/wordml/sdtdatahash" xmlns:w16sdtfl="http://schemas.microsoft.com/office/word/2024/wordml/sdtformatlock" xmlns:w16se="http://schemas.microsoft.com/office/word/2015/wordml/symex" xmlns:wpg="http://schemas.microsoft.com/office/word/2010/wordprocessingGroup" xmlns:wpi="http://schemas.microsoft.com/office/word/2010/wordprocessingInk" xmlns:wne="http://schemas.microsoft.com/office/word/2006/wordml" xmlns:wps="http://schemas.microsoft.com/office/word/2010/wordprocessingShape" mc:Ignorable="w14 w15 w16se w16cid w16 w16cex w16sdtdh w16sdtfl w16du wp14">
+<w:endnotes xmlns:wpc="http://schemas.microsoft.com/office/word/2010/wordprocessingCanvas" xmlns:cx="http://schemas.microsoft.com/office/drawing/2014/chartex" xmlns:cx1="http://schemas.microsoft.com/office/drawing/2015/9/8/chartex" xmlns:cx2="http://schemas.microsoft.com/office/drawing/2015/10/21/chartex" xmlns:cx3="http://schemas.microsoft.com/office/drawing/2016/5/9/chartex" xmlns:cx4="http://schemas.microsoft.com/office/drawing/2016/5/10/chartex" xmlns:cx5="http://schemas.microsoft.com/office/drawing/2016/5/11/chartex" xmlns:cx6="http://schemas.microsoft.com/office/drawing/2016/5/12/chartex" xmlns:cx7="http://schemas.microsoft.com/office/drawing/2016/5/13/chartex" xmlns:cx8="http://schemas.microsoft.com/office/drawing/2016/5/14/chartex" xmlns:mc="http://schemas.openxmlformats.org/markup-compatibility/2006" xmlns:aink="http://schemas.microsoft.com/office/drawing/2016/ink" xmlns:am3d="http://schemas.microsoft.com/office/drawing/2017/model3d" xmlns:o="urn:schemas-microsoft-com:office:office" xmlns:oel="http://schemas.microsoft.com/office/2019/extlst" xmlns:r="http://schemas.openxmlformats.org/officeDocument/2006/relationships" xmlns:m="http://schemas.openxmlformats.org/officeDocument/2006/math" xmlns:v="urn:schemas-microsoft-com:vml" xmlns:wp14="http://schemas.microsoft.com/office/word/2010/wordprocessingDrawing" xmlns:wp="http://schemas.openxmlformats.org/drawingml/2006/wordprocessingDrawing" xmlns:w10="urn:schemas-microsoft-com:office:word" xmlns:w="http://schemas.openxmlformats.org/wordprocessingml/2006/main" xmlns:w14="http://schemas.microsoft.com/office/word/2010/wordml" xmlns:w15="http://schemas.microsoft.com/office/word/2012/wordml" xmlns:w16cex="http://schemas.microsoft.com/office/word/2018/wordml/cex" xmlns:w16cid="http://schemas.microsoft.com/office/word/2016/wordml/cid" xmlns:w16="http://schemas.microsoft.com/office/word/2018/wordml" xmlns:w16du="http://schemas.microsoft.com/office/word/2023/wordml/word16du" xmlns:w16sdtdh="http://schemas.microsoft.com/office/word/2020/wordml/sdtdatahash" xmlns:w16sdtfl="http://schemas.microsoft.com/office/word/2024/wordml/sdtformatlock" xmlns:w16se="http://schemas.microsoft.com/office/word/2015/wordml/symex" xmlns:wpg="http://schemas.microsoft.com/office/word/2010/wordprocessingGroup" xmlns:wpi="http://schemas.microsoft.com/office/word/2010/wordprocessingInk" xmlns:wne="http://schemas.microsoft.com/office/word/2006/wordml" xmlns:wps="http://schemas.microsoft.com/office/word/2010/wordprocessingShape" mc:Ignorable="w14 w15 w16se w16cid w16 w16cex w16sdtdh w16sdtfl w16du wp14">
   <w:endnote w:type="separator" w:id="-1">
     <w:p>
       <w:pPr>
@@ -9132,7 +9186,7 @@
 </file>
 
 <file path=word/footer1.xml><?xml version="1.0" encoding="utf-8"?>
-<w:ftr xmlns:wpc="http://schemas.microsoft.com/office/word/2010/wordprocessingCanvas" xmlns:cx="http://schemas.microsoft.com/office/drawing/2014/chartex" xmlns:cx1="http://schemas.microsoft.com/office/drawing/2015/9/8/chartex" xmlns:cx2="http://schemas.microsoft.com/office/drawing/2015/10/21/chartex" xmlns:cx3="http://schemas.microsoft.com/office/drawing/2016/5/9/chartex" xmlns:cx4="http://schemas.microsoft.com/office/drawing/2016/5/10/chartex" xmlns:cx5="http://schemas.microsoft.com/office/drawing/2016/5/11/chartex" xmlns:cx6="http://schemas.microsoft.com/office/drawing/2016/5/12/chartex" xmlns:cx7="http://schemas.microsoft.com/office/drawing/2016/5/13/chartex" xmlns:cx8="http://schemas.microsoft.com/office/drawing/2016/5/14/chartex" xmlns:mc="http://schemas.openxmlformats.org/markup-compatibility/2006" xmlns:aink="http://schemas.microsoft.com/office/drawing/2016/ink" xmlns:am3d="http://schemas.microsoft.com/office/drawing/2017/model3d" xmlns:o="urn:schemas-microsoft-com:office:office" xmlns:oel="http://schemas.microsoft.com/office/2019/extlst" xmlns:r="http://schemas.openxmlformats.org/officeDocument/2006/relationships" xmlns:m="http://schemas.openxmlformats.org/officeDocument/2006/math" xmlns:v="urn:schemas-microsoft-com:vml" xmlns:wp14="http://schemas.microsoft.com/office/word/2010/wordprocessingDrawing" xmlns:wp="http://schemas.openxmlformats.org/drawingml/2006/wordprocessingDrawing" xmlns:w10="urn:schemas-microsoft-com:office:word" xmlns:w="http://schemas.openxmlformats.org/wordprocessingml/2006/main" xmlns:w14="http://schemas.microsoft.com/office/word/2010/wordml" xmlns:w15="http://schemas.microsoft.com/office/word/2012/wordml" xmlns:w16cei="http://schemas.microsoft.com/office/word/2026/wordml/cei" xmlns:w16cex="http://schemas.microsoft.com/office/word/2018/wordml/cex" xmlns:w16cid="http://schemas.microsoft.com/office/word/2016/wordml/cid" xmlns:w16="http://schemas.microsoft.com/office/word/2018/wordml" xmlns:w16du="http://schemas.microsoft.com/office/word/2023/wordml/word16du" xmlns:w16sdtdh="http://schemas.microsoft.com/office/word/2020/wordml/sdtdatahash" xmlns:w16sdtfl="http://schemas.microsoft.com/office/word/2024/wordml/sdtformatlock" xmlns:w16se="http://schemas.microsoft.com/office/word/2015/wordml/symex" xmlns:wpg="http://schemas.microsoft.com/office/word/2010/wordprocessingGroup" xmlns:wpi="http://schemas.microsoft.com/office/word/2010/wordprocessingInk" xmlns:wne="http://schemas.microsoft.com/office/word/2006/wordml" xmlns:wps="http://schemas.microsoft.com/office/word/2010/wordprocessingShape" mc:Ignorable="w14 w15 w16se w16cid w16 w16cex w16sdtdh w16sdtfl w16du wp14">
+<w:ftr xmlns:wpc="http://schemas.microsoft.com/office/word/2010/wordprocessingCanvas" xmlns:cx="http://schemas.microsoft.com/office/drawing/2014/chartex" xmlns:cx1="http://schemas.microsoft.com/office/drawing/2015/9/8/chartex" xmlns:cx2="http://schemas.microsoft.com/office/drawing/2015/10/21/chartex" xmlns:cx3="http://schemas.microsoft.com/office/drawing/2016/5/9/chartex" xmlns:cx4="http://schemas.microsoft.com/office/drawing/2016/5/10/chartex" xmlns:cx5="http://schemas.microsoft.com/office/drawing/2016/5/11/chartex" xmlns:cx6="http://schemas.microsoft.com/office/drawing/2016/5/12/chartex" xmlns:cx7="http://schemas.microsoft.com/office/drawing/2016/5/13/chartex" xmlns:cx8="http://schemas.microsoft.com/office/drawing/2016/5/14/chartex" xmlns:mc="http://schemas.openxmlformats.org/markup-compatibility/2006" xmlns:aink="http://schemas.microsoft.com/office/drawing/2016/ink" xmlns:am3d="http://schemas.microsoft.com/office/drawing/2017/model3d" xmlns:o="urn:schemas-microsoft-com:office:office" xmlns:oel="http://schemas.microsoft.com/office/2019/extlst" xmlns:r="http://schemas.openxmlformats.org/officeDocument/2006/relationships" xmlns:m="http://schemas.openxmlformats.org/officeDocument/2006/math" xmlns:v="urn:schemas-microsoft-com:vml" xmlns:wp14="http://schemas.microsoft.com/office/word/2010/wordprocessingDrawing" xmlns:wp="http://schemas.openxmlformats.org/drawingml/2006/wordprocessingDrawing" xmlns:w10="urn:schemas-microsoft-com:office:word" xmlns:w="http://schemas.openxmlformats.org/wordprocessingml/2006/main" xmlns:w14="http://schemas.microsoft.com/office/word/2010/wordml" xmlns:w15="http://schemas.microsoft.com/office/word/2012/wordml" xmlns:w16cex="http://schemas.microsoft.com/office/word/2018/wordml/cex" xmlns:w16cid="http://schemas.microsoft.com/office/word/2016/wordml/cid" xmlns:w16="http://schemas.microsoft.com/office/word/2018/wordml" xmlns:w16du="http://schemas.microsoft.com/office/word/2023/wordml/word16du" xmlns:w16sdtdh="http://schemas.microsoft.com/office/word/2020/wordml/sdtdatahash" xmlns:w16sdtfl="http://schemas.microsoft.com/office/word/2024/wordml/sdtformatlock" xmlns:w16se="http://schemas.microsoft.com/office/word/2015/wordml/symex" xmlns:wpg="http://schemas.microsoft.com/office/word/2010/wordprocessingGroup" xmlns:wpi="http://schemas.microsoft.com/office/word/2010/wordprocessingInk" xmlns:wne="http://schemas.microsoft.com/office/word/2006/wordml" xmlns:wps="http://schemas.microsoft.com/office/word/2010/wordprocessingShape" mc:Ignorable="w14 w15 w16se w16cid w16 w16cex w16sdtdh w16sdtfl w16du wp14">
   <w:p>
     <w:pPr>
       <w:tabs>
@@ -9324,7 +9378,7 @@
 </file>
 
 <file path=word/footnotes.xml><?xml version="1.0" encoding="utf-8"?>
-<w:footnotes xmlns:wpc="http://schemas.microsoft.com/office/word/2010/wordprocessingCanvas" xmlns:cx="http://schemas.microsoft.com/office/drawing/2014/chartex" xmlns:cx1="http://schemas.microsoft.com/office/drawing/2015/9/8/chartex" xmlns:cx2="http://schemas.microsoft.com/office/drawing/2015/10/21/chartex" xmlns:cx3="http://schemas.microsoft.com/office/drawing/2016/5/9/chartex" xmlns:cx4="http://schemas.microsoft.com/office/drawing/2016/5/10/chartex" xmlns:cx5="http://schemas.microsoft.com/office/drawing/2016/5/11/chartex" xmlns:cx6="http://schemas.microsoft.com/office/drawing/2016/5/12/chartex" xmlns:cx7="http://schemas.microsoft.com/office/drawing/2016/5/13/chartex" xmlns:cx8="http://schemas.microsoft.com/office/drawing/2016/5/14/chartex" xmlns:mc="http://schemas.openxmlformats.org/markup-compatibility/2006" xmlns:aink="http://schemas.microsoft.com/office/drawing/2016/ink" xmlns:am3d="http://schemas.microsoft.com/office/drawing/2017/model3d" xmlns:o="urn:schemas-microsoft-com:office:office" xmlns:oel="http://schemas.microsoft.com/office/2019/extlst" xmlns:r="http://schemas.openxmlformats.org/officeDocument/2006/relationships" xmlns:m="http://schemas.openxmlformats.org/officeDocument/2006/math" xmlns:v="urn:schemas-microsoft-com:vml" xmlns:wp14="http://schemas.microsoft.com/office/word/2010/wordprocessingDrawing" xmlns:wp="http://schemas.openxmlformats.org/drawingml/2006/wordprocessingDrawing" xmlns:w10="urn:schemas-microsoft-com:office:word" xmlns:w="http://schemas.openxmlformats.org/wordprocessingml/2006/main" xmlns:w14="http://schemas.microsoft.com/office/word/2010/wordml" xmlns:w15="http://schemas.microsoft.com/office/word/2012/wordml" xmlns:w16cei="http://schemas.microsoft.com/office/word/2026/wordml/cei" xmlns:w16cex="http://schemas.microsoft.com/office/word/2018/wordml/cex" xmlns:w16cid="http://schemas.microsoft.com/office/word/2016/wordml/cid" xmlns:w16="http://schemas.microsoft.com/office/word/2018/wordml" xmlns:w16du="http://schemas.microsoft.com/office/word/2023/wordml/word16du" xmlns:w16sdtdh="http://schemas.microsoft.com/office/word/2020/wordml/sdtdatahash" xmlns:w16sdtfl="http://schemas.microsoft.com/office/word/2024/wordml/sdtformatlock" xmlns:w16se="http://schemas.microsoft.com/office/word/2015/wordml/symex" xmlns:wpg="http://schemas.microsoft.com/office/word/2010/wordprocessingGroup" xmlns:wpi="http://schemas.microsoft.com/office/word/2010/wordprocessingInk" xmlns:wne="http://schemas.microsoft.com/office/word/2006/wordml" xmlns:wps="http://schemas.microsoft.com/office/word/2010/wordprocessingShape" mc:Ignorable="w14 w15 w16se w16cid w16 w16cex w16sdtdh w16sdtfl w16du wp14">
+<w:footnotes xmlns:wpc="http://schemas.microsoft.com/office/word/2010/wordprocessingCanvas" xmlns:cx="http://schemas.microsoft.com/office/drawing/2014/chartex" xmlns:cx1="http://schemas.microsoft.com/office/drawing/2015/9/8/chartex" xmlns:cx2="http://schemas.microsoft.com/office/drawing/2015/10/21/chartex" xmlns:cx3="http://schemas.microsoft.com/office/drawing/2016/5/9/chartex" xmlns:cx4="http://schemas.microsoft.com/office/drawing/2016/5/10/chartex" xmlns:cx5="http://schemas.microsoft.com/office/drawing/2016/5/11/chartex" xmlns:cx6="http://schemas.microsoft.com/office/drawing/2016/5/12/chartex" xmlns:cx7="http://schemas.microsoft.com/office/drawing/2016/5/13/chartex" xmlns:cx8="http://schemas.microsoft.com/office/drawing/2016/5/14/chartex" xmlns:mc="http://schemas.openxmlformats.org/markup-compatibility/2006" xmlns:aink="http://schemas.microsoft.com/office/drawing/2016/ink" xmlns:am3d="http://schemas.microsoft.com/office/drawing/2017/model3d" xmlns:o="urn:schemas-microsoft-com:office:office" xmlns:oel="http://schemas.microsoft.com/office/2019/extlst" xmlns:r="http://schemas.openxmlformats.org/officeDocument/2006/relationships" xmlns:m="http://schemas.openxmlformats.org/officeDocument/2006/math" xmlns:v="urn:schemas-microsoft-com:vml" xmlns:wp14="http://schemas.microsoft.com/office/word/2010/wordprocessingDrawing" xmlns:wp="http://schemas.openxmlformats.org/drawingml/2006/wordprocessingDrawing" xmlns:w10="urn:schemas-microsoft-com:office:word" xmlns:w="http://schemas.openxmlformats.org/wordprocessingml/2006/main" xmlns:w14="http://schemas.microsoft.com/office/word/2010/wordml" xmlns:w15="http://schemas.microsoft.com/office/word/2012/wordml" xmlns:w16cex="http://schemas.microsoft.com/office/word/2018/wordml/cex" xmlns:w16cid="http://schemas.microsoft.com/office/word/2016/wordml/cid" xmlns:w16="http://schemas.microsoft.com/office/word/2018/wordml" xmlns:w16du="http://schemas.microsoft.com/office/word/2023/wordml/word16du" xmlns:w16sdtdh="http://schemas.microsoft.com/office/word/2020/wordml/sdtdatahash" xmlns:w16sdtfl="http://schemas.microsoft.com/office/word/2024/wordml/sdtformatlock" xmlns:w16se="http://schemas.microsoft.com/office/word/2015/wordml/symex" xmlns:wpg="http://schemas.microsoft.com/office/word/2010/wordprocessingGroup" xmlns:wpi="http://schemas.microsoft.com/office/word/2010/wordprocessingInk" xmlns:wne="http://schemas.microsoft.com/office/word/2006/wordml" xmlns:wps="http://schemas.microsoft.com/office/word/2010/wordprocessingShape" mc:Ignorable="w14 w15 w16se w16cid w16 w16cex w16sdtdh w16sdtfl w16du wp14">
   <w:footnote w:type="separator" w:id="-1">
     <w:p>
       <w:pPr>
@@ -9349,7 +9403,7 @@
 </file>
 
 <file path=word/numbering.xml><?xml version="1.0" encoding="utf-8"?>
-<w:numbering xmlns:wpc="http://schemas.microsoft.com/office/word/2010/wordprocessingCanvas" xmlns:cx="http://schemas.microsoft.com/office/drawing/2014/chartex" xmlns:cx1="http://schemas.microsoft.com/office/drawing/2015/9/8/chartex" xmlns:cx2="http://schemas.microsoft.com/office/drawing/2015/10/21/chartex" xmlns:cx3="http://schemas.microsoft.com/office/drawing/2016/5/9/chartex" xmlns:cx4="http://schemas.microsoft.com/office/drawing/2016/5/10/chartex" xmlns:cx5="http://schemas.microsoft.com/office/drawing/2016/5/11/chartex" xmlns:cx6="http://schemas.microsoft.com/office/drawing/2016/5/12/chartex" xmlns:cx7="http://schemas.microsoft.com/office/drawing/2016/5/13/chartex" xmlns:cx8="http://schemas.microsoft.com/office/drawing/2016/5/14/chartex" xmlns:mc="http://schemas.openxmlformats.org/markup-compatibility/2006" xmlns:aink="http://schemas.microsoft.com/office/drawing/2016/ink" xmlns:am3d="http://schemas.microsoft.com/office/drawing/2017/model3d" xmlns:o="urn:schemas-microsoft-com:office:office" xmlns:oel="http://schemas.microsoft.com/office/2019/extlst" xmlns:r="http://schemas.openxmlformats.org/officeDocument/2006/relationships" xmlns:m="http://schemas.openxmlformats.org/officeDocument/2006/math" xmlns:v="urn:schemas-microsoft-com:vml" xmlns:wp14="http://schemas.microsoft.com/office/word/2010/wordprocessingDrawing" xmlns:wp="http://schemas.openxmlformats.org/drawingml/2006/wordprocessingDrawing" xmlns:w10="urn:schemas-microsoft-com:office:word" xmlns:w="http://schemas.openxmlformats.org/wordprocessingml/2006/main" xmlns:w14="http://schemas.microsoft.com/office/word/2010/wordml" xmlns:w15="http://schemas.microsoft.com/office/word/2012/wordml" xmlns:w16cei="http://schemas.microsoft.com/office/word/2026/wordml/cei" xmlns:w16cex="http://schemas.microsoft.com/office/word/2018/wordml/cex" xmlns:w16cid="http://schemas.microsoft.com/office/word/2016/wordml/cid" xmlns:w16="http://schemas.microsoft.com/office/word/2018/wordml" xmlns:w16du="http://schemas.microsoft.com/office/word/2023/wordml/word16du" xmlns:w16sdtdh="http://schemas.microsoft.com/office/word/2020/wordml/sdtdatahash" xmlns:w16sdtfl="http://schemas.microsoft.com/office/word/2024/wordml/sdtformatlock" xmlns:w16se="http://schemas.microsoft.com/office/word/2015/wordml/symex" xmlns:wpg="http://schemas.microsoft.com/office/word/2010/wordprocessingGroup" xmlns:wpi="http://schemas.microsoft.com/office/word/2010/wordprocessingInk" xmlns:wne="http://schemas.microsoft.com/office/word/2006/wordml" xmlns:wps="http://schemas.microsoft.com/office/word/2010/wordprocessingShape" mc:Ignorable="w14 w15 w16se w16cid w16 w16cex w16sdtdh w16sdtfl w16du wp14">
+<w:numbering xmlns:wpc="http://schemas.microsoft.com/office/word/2010/wordprocessingCanvas" xmlns:cx="http://schemas.microsoft.com/office/drawing/2014/chartex" xmlns:cx1="http://schemas.microsoft.com/office/drawing/2015/9/8/chartex" xmlns:cx2="http://schemas.microsoft.com/office/drawing/2015/10/21/chartex" xmlns:cx3="http://schemas.microsoft.com/office/drawing/2016/5/9/chartex" xmlns:cx4="http://schemas.microsoft.com/office/drawing/2016/5/10/chartex" xmlns:cx5="http://schemas.microsoft.com/office/drawing/2016/5/11/chartex" xmlns:cx6="http://schemas.microsoft.com/office/drawing/2016/5/12/chartex" xmlns:cx7="http://schemas.microsoft.com/office/drawing/2016/5/13/chartex" xmlns:cx8="http://schemas.microsoft.com/office/drawing/2016/5/14/chartex" xmlns:mc="http://schemas.openxmlformats.org/markup-compatibility/2006" xmlns:aink="http://schemas.microsoft.com/office/drawing/2016/ink" xmlns:am3d="http://schemas.microsoft.com/office/drawing/2017/model3d" xmlns:o="urn:schemas-microsoft-com:office:office" xmlns:oel="http://schemas.microsoft.com/office/2019/extlst" xmlns:r="http://schemas.openxmlformats.org/officeDocument/2006/relationships" xmlns:m="http://schemas.openxmlformats.org/officeDocument/2006/math" xmlns:v="urn:schemas-microsoft-com:vml" xmlns:wp14="http://schemas.microsoft.com/office/word/2010/wordprocessingDrawing" xmlns:wp="http://schemas.openxmlformats.org/drawingml/2006/wordprocessingDrawing" xmlns:w10="urn:schemas-microsoft-com:office:word" xmlns:w="http://schemas.openxmlformats.org/wordprocessingml/2006/main" xmlns:w14="http://schemas.microsoft.com/office/word/2010/wordml" xmlns:w15="http://schemas.microsoft.com/office/word/2012/wordml" xmlns:w16cex="http://schemas.microsoft.com/office/word/2018/wordml/cex" xmlns:w16cid="http://schemas.microsoft.com/office/word/2016/wordml/cid" xmlns:w16="http://schemas.microsoft.com/office/word/2018/wordml" xmlns:w16du="http://schemas.microsoft.com/office/word/2023/wordml/word16du" xmlns:w16sdtdh="http://schemas.microsoft.com/office/word/2020/wordml/sdtdatahash" xmlns:w16sdtfl="http://schemas.microsoft.com/office/word/2024/wordml/sdtformatlock" xmlns:w16se="http://schemas.microsoft.com/office/word/2015/wordml/symex" xmlns:wpg="http://schemas.microsoft.com/office/word/2010/wordprocessingGroup" xmlns:wpi="http://schemas.microsoft.com/office/word/2010/wordprocessingInk" xmlns:wne="http://schemas.microsoft.com/office/word/2006/wordml" xmlns:wps="http://schemas.microsoft.com/office/word/2010/wordprocessingShape" mc:Ignorable="w14 w15 w16se w16cid w16 w16cex w16sdtdh w16sdtfl w16du wp14">
   <w:abstractNum w:abstractNumId="0" w15:restartNumberingAfterBreak="0">
     <w:nsid w:val="03A50229"/>
     <w:multiLevelType w:val="hybridMultilevel"/>
@@ -9883,6 +9937,119 @@
     </w:lvl>
   </w:abstractNum>
   <w:abstractNum w:abstractNumId="5" w15:restartNumberingAfterBreak="0">
+    <w:nsid w:val="33422D50"/>
+    <w:multiLevelType w:val="multilevel"/>
+    <w:tmpl w:val="3BE40A4E"/>
+    <w:lvl w:ilvl="0">
+      <w:start w:val="1"/>
+      <w:numFmt w:val="decimal"/>
+      <w:lvlText w:val="%1."/>
+      <w:lvlJc w:val="left"/>
+      <w:pPr>
+        <w:tabs>
+          <w:tab w:val="num" w:pos="720"/>
+        </w:tabs>
+        <w:ind w:left="720" w:hanging="360"/>
+      </w:pPr>
+    </w:lvl>
+    <w:lvl w:ilvl="1" w:tentative="1">
+      <w:start w:val="1"/>
+      <w:numFmt w:val="decimal"/>
+      <w:lvlText w:val="%2."/>
+      <w:lvlJc w:val="left"/>
+      <w:pPr>
+        <w:tabs>
+          <w:tab w:val="num" w:pos="1440"/>
+        </w:tabs>
+        <w:ind w:left="1440" w:hanging="360"/>
+      </w:pPr>
+    </w:lvl>
+    <w:lvl w:ilvl="2" w:tentative="1">
+      <w:start w:val="1"/>
+      <w:numFmt w:val="decimal"/>
+      <w:lvlText w:val="%3."/>
+      <w:lvlJc w:val="left"/>
+      <w:pPr>
+        <w:tabs>
+          <w:tab w:val="num" w:pos="2160"/>
+        </w:tabs>
+        <w:ind w:left="2160" w:hanging="360"/>
+      </w:pPr>
+    </w:lvl>
+    <w:lvl w:ilvl="3" w:tentative="1">
+      <w:start w:val="1"/>
+      <w:numFmt w:val="decimal"/>
+      <w:lvlText w:val="%4."/>
+      <w:lvlJc w:val="left"/>
+      <w:pPr>
+        <w:tabs>
+          <w:tab w:val="num" w:pos="2880"/>
+        </w:tabs>
+        <w:ind w:left="2880" w:hanging="360"/>
+      </w:pPr>
+    </w:lvl>
+    <w:lvl w:ilvl="4" w:tentative="1">
+      <w:start w:val="1"/>
+      <w:numFmt w:val="decimal"/>
+      <w:lvlText w:val="%5."/>
+      <w:lvlJc w:val="left"/>
+      <w:pPr>
+        <w:tabs>
+          <w:tab w:val="num" w:pos="3600"/>
+        </w:tabs>
+        <w:ind w:left="3600" w:hanging="360"/>
+      </w:pPr>
+    </w:lvl>
+    <w:lvl w:ilvl="5" w:tentative="1">
+      <w:start w:val="1"/>
+      <w:numFmt w:val="decimal"/>
+      <w:lvlText w:val="%6."/>
+      <w:lvlJc w:val="left"/>
+      <w:pPr>
+        <w:tabs>
+          <w:tab w:val="num" w:pos="4320"/>
+        </w:tabs>
+        <w:ind w:left="4320" w:hanging="360"/>
+      </w:pPr>
+    </w:lvl>
+    <w:lvl w:ilvl="6" w:tentative="1">
+      <w:start w:val="1"/>
+      <w:numFmt w:val="decimal"/>
+      <w:lvlText w:val="%7."/>
+      <w:lvlJc w:val="left"/>
+      <w:pPr>
+        <w:tabs>
+          <w:tab w:val="num" w:pos="5040"/>
+        </w:tabs>
+        <w:ind w:left="5040" w:hanging="360"/>
+      </w:pPr>
+    </w:lvl>
+    <w:lvl w:ilvl="7" w:tentative="1">
+      <w:start w:val="1"/>
+      <w:numFmt w:val="decimal"/>
+      <w:lvlText w:val="%8."/>
+      <w:lvlJc w:val="left"/>
+      <w:pPr>
+        <w:tabs>
+          <w:tab w:val="num" w:pos="5760"/>
+        </w:tabs>
+        <w:ind w:left="5760" w:hanging="360"/>
+      </w:pPr>
+    </w:lvl>
+    <w:lvl w:ilvl="8" w:tentative="1">
+      <w:start w:val="1"/>
+      <w:numFmt w:val="decimal"/>
+      <w:lvlText w:val="%9."/>
+      <w:lvlJc w:val="left"/>
+      <w:pPr>
+        <w:tabs>
+          <w:tab w:val="num" w:pos="6480"/>
+        </w:tabs>
+        <w:ind w:left="6480" w:hanging="360"/>
+      </w:pPr>
+    </w:lvl>
+  </w:abstractNum>
+  <w:abstractNum w:abstractNumId="6" w15:restartNumberingAfterBreak="0">
     <w:nsid w:val="3375507B"/>
     <w:multiLevelType w:val="hybridMultilevel"/>
     <w:tmpl w:val="869C716C"/>
@@ -9971,7 +10138,7 @@
       </w:pPr>
     </w:lvl>
   </w:abstractNum>
-  <w:abstractNum w:abstractNumId="6" w15:restartNumberingAfterBreak="0">
+  <w:abstractNum w:abstractNumId="7" w15:restartNumberingAfterBreak="0">
     <w:nsid w:val="33977252"/>
     <w:multiLevelType w:val="hybridMultilevel"/>
     <w:tmpl w:val="66788666"/>
@@ -10060,7 +10227,7 @@
       </w:pPr>
     </w:lvl>
   </w:abstractNum>
-  <w:abstractNum w:abstractNumId="7" w15:restartNumberingAfterBreak="0">
+  <w:abstractNum w:abstractNumId="8" w15:restartNumberingAfterBreak="0">
     <w:nsid w:val="40B21E78"/>
     <w:multiLevelType w:val="hybridMultilevel"/>
     <w:tmpl w:val="2ECA7394"/>
@@ -10146,7 +10313,7 @@
       </w:pPr>
     </w:lvl>
   </w:abstractNum>
-  <w:abstractNum w:abstractNumId="8" w15:restartNumberingAfterBreak="0">
+  <w:abstractNum w:abstractNumId="9" w15:restartNumberingAfterBreak="0">
     <w:nsid w:val="41C15DF7"/>
     <w:multiLevelType w:val="hybridMultilevel"/>
     <w:tmpl w:val="52B08E6C"/>
@@ -10237,7 +10404,7 @@
       </w:pPr>
     </w:lvl>
   </w:abstractNum>
-  <w:abstractNum w:abstractNumId="9" w15:restartNumberingAfterBreak="0">
+  <w:abstractNum w:abstractNumId="10" w15:restartNumberingAfterBreak="0">
     <w:nsid w:val="47280C7B"/>
     <w:multiLevelType w:val="hybridMultilevel"/>
     <w:tmpl w:val="EEB06C44"/>
@@ -10350,7 +10517,7 @@
       </w:rPr>
     </w:lvl>
   </w:abstractNum>
-  <w:abstractNum w:abstractNumId="10" w15:restartNumberingAfterBreak="0">
+  <w:abstractNum w:abstractNumId="11" w15:restartNumberingAfterBreak="0">
     <w:nsid w:val="59013587"/>
     <w:multiLevelType w:val="hybridMultilevel"/>
     <w:tmpl w:val="37BA565E"/>
@@ -10439,7 +10606,7 @@
       </w:pPr>
     </w:lvl>
   </w:abstractNum>
-  <w:abstractNum w:abstractNumId="11" w15:restartNumberingAfterBreak="0">
+  <w:abstractNum w:abstractNumId="12" w15:restartNumberingAfterBreak="0">
     <w:nsid w:val="68DD3200"/>
     <w:multiLevelType w:val="multilevel"/>
     <w:tmpl w:val="B50412CC"/>
@@ -10552,7 +10719,156 @@
       </w:pPr>
     </w:lvl>
   </w:abstractNum>
-  <w:abstractNum w:abstractNumId="12" w15:restartNumberingAfterBreak="0">
+  <w:abstractNum w:abstractNumId="13" w15:restartNumberingAfterBreak="0">
+    <w:nsid w:val="6DF4031F"/>
+    <w:multiLevelType w:val="multilevel"/>
+    <w:tmpl w:val="C8645B08"/>
+    <w:lvl w:ilvl="0">
+      <w:start w:val="1"/>
+      <w:numFmt w:val="bullet"/>
+      <w:lvlText w:val=""/>
+      <w:lvlJc w:val="left"/>
+      <w:pPr>
+        <w:tabs>
+          <w:tab w:val="num" w:pos="720"/>
+        </w:tabs>
+        <w:ind w:left="720" w:hanging="360"/>
+      </w:pPr>
+      <w:rPr>
+        <w:rFonts w:ascii="Symbol" w:hAnsi="Symbol" w:hint="default"/>
+        <w:sz w:val="20"/>
+      </w:rPr>
+    </w:lvl>
+    <w:lvl w:ilvl="1" w:tentative="1">
+      <w:start w:val="1"/>
+      <w:numFmt w:val="bullet"/>
+      <w:lvlText w:val=""/>
+      <w:lvlJc w:val="left"/>
+      <w:pPr>
+        <w:tabs>
+          <w:tab w:val="num" w:pos="1440"/>
+        </w:tabs>
+        <w:ind w:left="1440" w:hanging="360"/>
+      </w:pPr>
+      <w:rPr>
+        <w:rFonts w:ascii="Symbol" w:hAnsi="Symbol" w:hint="default"/>
+        <w:sz w:val="20"/>
+      </w:rPr>
+    </w:lvl>
+    <w:lvl w:ilvl="2" w:tentative="1">
+      <w:start w:val="1"/>
+      <w:numFmt w:val="bullet"/>
+      <w:lvlText w:val=""/>
+      <w:lvlJc w:val="left"/>
+      <w:pPr>
+        <w:tabs>
+          <w:tab w:val="num" w:pos="2160"/>
+        </w:tabs>
+        <w:ind w:left="2160" w:hanging="360"/>
+      </w:pPr>
+      <w:rPr>
+        <w:rFonts w:ascii="Symbol" w:hAnsi="Symbol" w:hint="default"/>
+        <w:sz w:val="20"/>
+      </w:rPr>
+    </w:lvl>
+    <w:lvl w:ilvl="3" w:tentative="1">
+      <w:start w:val="1"/>
+      <w:numFmt w:val="bullet"/>
+      <w:lvlText w:val=""/>
+      <w:lvlJc w:val="left"/>
+      <w:pPr>
+        <w:tabs>
+          <w:tab w:val="num" w:pos="2880"/>
+        </w:tabs>
+        <w:ind w:left="2880" w:hanging="360"/>
+      </w:pPr>
+      <w:rPr>
+        <w:rFonts w:ascii="Symbol" w:hAnsi="Symbol" w:hint="default"/>
+        <w:sz w:val="20"/>
+      </w:rPr>
+    </w:lvl>
+    <w:lvl w:ilvl="4" w:tentative="1">
+      <w:start w:val="1"/>
+      <w:numFmt w:val="bullet"/>
+      <w:lvlText w:val=""/>
+      <w:lvlJc w:val="left"/>
+      <w:pPr>
+        <w:tabs>
+          <w:tab w:val="num" w:pos="3600"/>
+        </w:tabs>
+        <w:ind w:left="3600" w:hanging="360"/>
+      </w:pPr>
+      <w:rPr>
+        <w:rFonts w:ascii="Symbol" w:hAnsi="Symbol" w:hint="default"/>
+        <w:sz w:val="20"/>
+      </w:rPr>
+    </w:lvl>
+    <w:lvl w:ilvl="5" w:tentative="1">
+      <w:start w:val="1"/>
+      <w:numFmt w:val="bullet"/>
+      <w:lvlText w:val=""/>
+      <w:lvlJc w:val="left"/>
+      <w:pPr>
+        <w:tabs>
+          <w:tab w:val="num" w:pos="4320"/>
+        </w:tabs>
+        <w:ind w:left="4320" w:hanging="360"/>
+      </w:pPr>
+      <w:rPr>
+        <w:rFonts w:ascii="Symbol" w:hAnsi="Symbol" w:hint="default"/>
+        <w:sz w:val="20"/>
+      </w:rPr>
+    </w:lvl>
+    <w:lvl w:ilvl="6" w:tentative="1">
+      <w:start w:val="1"/>
+      <w:numFmt w:val="bullet"/>
+      <w:lvlText w:val=""/>
+      <w:lvlJc w:val="left"/>
+      <w:pPr>
+        <w:tabs>
+          <w:tab w:val="num" w:pos="5040"/>
+        </w:tabs>
+        <w:ind w:left="5040" w:hanging="360"/>
+      </w:pPr>
+      <w:rPr>
+        <w:rFonts w:ascii="Symbol" w:hAnsi="Symbol" w:hint="default"/>
+        <w:sz w:val="20"/>
+      </w:rPr>
+    </w:lvl>
+    <w:lvl w:ilvl="7" w:tentative="1">
+      <w:start w:val="1"/>
+      <w:numFmt w:val="bullet"/>
+      <w:lvlText w:val=""/>
+      <w:lvlJc w:val="left"/>
+      <w:pPr>
+        <w:tabs>
+          <w:tab w:val="num" w:pos="5760"/>
+        </w:tabs>
+        <w:ind w:left="5760" w:hanging="360"/>
+      </w:pPr>
+      <w:rPr>
+        <w:rFonts w:ascii="Symbol" w:hAnsi="Symbol" w:hint="default"/>
+        <w:sz w:val="20"/>
+      </w:rPr>
+    </w:lvl>
+    <w:lvl w:ilvl="8" w:tentative="1">
+      <w:start w:val="1"/>
+      <w:numFmt w:val="bullet"/>
+      <w:lvlText w:val=""/>
+      <w:lvlJc w:val="left"/>
+      <w:pPr>
+        <w:tabs>
+          <w:tab w:val="num" w:pos="6480"/>
+        </w:tabs>
+        <w:ind w:left="6480" w:hanging="360"/>
+      </w:pPr>
+      <w:rPr>
+        <w:rFonts w:ascii="Symbol" w:hAnsi="Symbol" w:hint="default"/>
+        <w:sz w:val="20"/>
+      </w:rPr>
+    </w:lvl>
+  </w:abstractNum>
+  <w:abstractNum w:abstractNumId="14" w15:restartNumberingAfterBreak="0">
     <w:nsid w:val="6DF80299"/>
     <w:multiLevelType w:val="hybridMultilevel"/>
     <w:tmpl w:val="E9E4786E"/>
@@ -10641,7 +10957,7 @@
       </w:pPr>
     </w:lvl>
   </w:abstractNum>
-  <w:abstractNum w:abstractNumId="13" w15:restartNumberingAfterBreak="0">
+  <w:abstractNum w:abstractNumId="15" w15:restartNumberingAfterBreak="0">
     <w:nsid w:val="758C3D2F"/>
     <w:multiLevelType w:val="hybridMultilevel"/>
     <w:tmpl w:val="BEBCADA6"/>
@@ -10732,7 +11048,7 @@
       </w:pPr>
     </w:lvl>
   </w:abstractNum>
-  <w:abstractNum w:abstractNumId="14" w15:restartNumberingAfterBreak="0">
+  <w:abstractNum w:abstractNumId="16" w15:restartNumberingAfterBreak="0">
     <w:nsid w:val="7D3115DD"/>
     <w:multiLevelType w:val="hybridMultilevel"/>
     <w:tmpl w:val="B5E003E6"/>
@@ -10823,7 +11139,7 @@
       </w:pPr>
     </w:lvl>
   </w:abstractNum>
-  <w:abstractNum w:abstractNumId="15" w15:restartNumberingAfterBreak="0">
+  <w:abstractNum w:abstractNumId="17" w15:restartNumberingAfterBreak="0">
     <w:nsid w:val="7ED809C9"/>
     <w:multiLevelType w:val="hybridMultilevel"/>
     <w:tmpl w:val="258CBD18"/>
@@ -10910,19 +11226,19 @@
     </w:lvl>
   </w:abstractNum>
   <w:num w:numId="1" w16cid:durableId="2144761605">
-    <w:abstractNumId w:val="9"/>
+    <w:abstractNumId w:val="10"/>
   </w:num>
   <w:num w:numId="2" w16cid:durableId="23026298">
     <w:abstractNumId w:val="1"/>
   </w:num>
   <w:num w:numId="3" w16cid:durableId="1278875319">
-    <w:abstractNumId w:val="11"/>
+    <w:abstractNumId w:val="12"/>
   </w:num>
   <w:num w:numId="4" w16cid:durableId="1357073030">
-    <w:abstractNumId w:val="7"/>
+    <w:abstractNumId w:val="8"/>
   </w:num>
   <w:num w:numId="5" w16cid:durableId="1302267209">
-    <w:abstractNumId w:val="15"/>
+    <w:abstractNumId w:val="17"/>
   </w:num>
   <w:num w:numId="6" w16cid:durableId="1810979616">
     <w:abstractNumId w:val="4"/>
@@ -10931,31 +11247,37 @@
     <w:abstractNumId w:val="3"/>
   </w:num>
   <w:num w:numId="8" w16cid:durableId="2045472307">
-    <w:abstractNumId w:val="13"/>
+    <w:abstractNumId w:val="15"/>
   </w:num>
   <w:num w:numId="9" w16cid:durableId="171652720">
-    <w:abstractNumId w:val="8"/>
+    <w:abstractNumId w:val="9"/>
   </w:num>
   <w:num w:numId="10" w16cid:durableId="746807257">
     <w:abstractNumId w:val="2"/>
   </w:num>
   <w:num w:numId="11" w16cid:durableId="2039037023">
-    <w:abstractNumId w:val="14"/>
+    <w:abstractNumId w:val="16"/>
   </w:num>
   <w:num w:numId="12" w16cid:durableId="882525631">
     <w:abstractNumId w:val="0"/>
   </w:num>
   <w:num w:numId="13" w16cid:durableId="1339426645">
-    <w:abstractNumId w:val="12"/>
+    <w:abstractNumId w:val="14"/>
   </w:num>
   <w:num w:numId="14" w16cid:durableId="126315735">
+    <w:abstractNumId w:val="7"/>
+  </w:num>
+  <w:num w:numId="15" w16cid:durableId="1412197761">
     <w:abstractNumId w:val="6"/>
   </w:num>
-  <w:num w:numId="15" w16cid:durableId="1412197761">
+  <w:num w:numId="16" w16cid:durableId="659650084">
+    <w:abstractNumId w:val="11"/>
+  </w:num>
+  <w:num w:numId="17" w16cid:durableId="1255939395">
+    <w:abstractNumId w:val="13"/>
+  </w:num>
+  <w:num w:numId="18" w16cid:durableId="1258054640">
     <w:abstractNumId w:val="5"/>
-  </w:num>
-  <w:num w:numId="16" w16cid:durableId="659650084">
-    <w:abstractNumId w:val="10"/>
   </w:num>
 </w:numbering>
 </file>

</xml_diff>